<commit_message>
se agrega codigo del libro como no editable en la vista formulario de edicion
</commit_message>
<xml_diff>
--- a/doc/Proyecto_CRUD.docx
+++ b/doc/Proyecto_CRUD.docx
@@ -20,7 +20,6 @@
         </w:rPr>
         <w:t xml:space="preserve">1 </w:t>
       </w:r>
-      <w:proofErr w:type="gramStart"/>
       <w:r>
         <w:rPr>
           <w:b/>
@@ -28,17 +27,7 @@
           <w:sz w:val="26"/>
           <w:szCs w:val="26"/>
         </w:rPr>
-        <w:t>Requerimientos</w:t>
-      </w:r>
-      <w:proofErr w:type="gramEnd"/>
-      <w:r>
-        <w:rPr>
-          <w:b/>
-          <w:bCs/>
-          <w:sz w:val="26"/>
-          <w:szCs w:val="26"/>
-        </w:rPr>
-        <w:t xml:space="preserve"> Funcionales</w:t>
+        <w:t>Requerimientos Funcionales</w:t>
       </w:r>
       <w:r>
         <w:rPr>
@@ -293,23 +282,7 @@
       </w:r>
       <w:proofErr w:type="spellEnd"/>
       <w:r>
-        <w:t xml:space="preserve"> con la estructura [A-Z</w:t>
-      </w:r>
-      <w:proofErr w:type="gramStart"/>
-      <w:r>
-        <w:t>][</w:t>
-      </w:r>
-      <w:proofErr w:type="gramEnd"/>
-      <w:r>
-        <w:t>0-9</w:t>
-      </w:r>
-      <w:proofErr w:type="gramStart"/>
-      <w:r>
-        <w:t>][</w:t>
-      </w:r>
-      <w:proofErr w:type="gramEnd"/>
-      <w:r>
-        <w:t xml:space="preserve">0-9] (ejemplo: A12, </w:t>
+        <w:t xml:space="preserve"> con la estructura [A-Z][0-9][0-9] (ejemplo: A12, </w:t>
       </w:r>
       <w:r>
         <w:t>B12</w:t>
@@ -490,13 +463,8 @@
         <w:t>como</w:t>
       </w:r>
       <w:r>
-        <w:t xml:space="preserve"> UNIQUE INDEX con tipo </w:t>
-      </w:r>
-      <w:proofErr w:type="gramStart"/>
-      <w:r>
-        <w:t>VARCHAR(</w:t>
-      </w:r>
-      <w:proofErr w:type="gramEnd"/>
+        <w:t xml:space="preserve"> UNIQUE INDEX con tipo VARCHAR(</w:t>
+      </w:r>
       <w:r>
         <w:t>3</w:t>
       </w:r>
@@ -655,10 +623,7 @@
         </w:numPr>
       </w:pPr>
       <w:r>
-        <w:t>CODE</w:t>
-      </w:r>
-      <w:r>
-        <w:t>:</w:t>
+        <w:t>CODE:</w:t>
       </w:r>
       <w:r>
         <w:t xml:space="preserve"> </w:t>
@@ -670,12 +635,10 @@
         <w:t xml:space="preserve">o </w:t>
       </w:r>
       <w:proofErr w:type="spellStart"/>
-      <w:proofErr w:type="gramStart"/>
       <w:r>
         <w:t>función,no</w:t>
       </w:r>
       <w:proofErr w:type="spellEnd"/>
-      <w:proofErr w:type="gramEnd"/>
       <w:r>
         <w:t xml:space="preserve"> </w:t>
       </w:r>
@@ -696,13 +659,8 @@
         <w:t>TITULO DEL LIBRO</w:t>
       </w:r>
       <w:r>
-        <w:t xml:space="preserve">: </w:t>
-      </w:r>
-      <w:proofErr w:type="gramStart"/>
-      <w:r>
-        <w:t>VARCHAR(</w:t>
-      </w:r>
-      <w:proofErr w:type="gramEnd"/>
+        <w:t>: VARCHAR(</w:t>
+      </w:r>
       <w:r>
         <w:t>255</w:t>
       </w:r>
@@ -721,13 +679,8 @@
         <w:t>A</w:t>
       </w:r>
       <w:r>
-        <w:t xml:space="preserve">utor: </w:t>
-      </w:r>
-      <w:proofErr w:type="gramStart"/>
-      <w:r>
-        <w:t>VARCHAR(</w:t>
-      </w:r>
-      <w:proofErr w:type="gramEnd"/>
+        <w:t>utor: VARCHAR(</w:t>
+      </w:r>
       <w:r>
         <w:t>255</w:t>
       </w:r>
@@ -748,13 +701,8 @@
       </w:r>
       <w:proofErr w:type="spellEnd"/>
       <w:r>
-        <w:t xml:space="preserve">: </w:t>
-      </w:r>
-      <w:proofErr w:type="gramStart"/>
-      <w:r>
-        <w:t>VARCHAR(</w:t>
-      </w:r>
-      <w:proofErr w:type="gramEnd"/>
+        <w:t>: VARCHAR(</w:t>
+      </w:r>
       <w:r>
         <w:t>255</w:t>
       </w:r>
@@ -1066,32 +1014,31 @@
           <w:sz w:val="20"/>
           <w:szCs w:val="20"/>
         </w:rPr>
-        <w:t>] &lt;-HTTP/JSON-</w:t>
-      </w:r>
-      <w:proofErr w:type="gramStart"/>
+        <w:t>] &lt;-HTTP/JSON-&gt;[ API REST/</w:t>
+      </w:r>
+      <w:proofErr w:type="spellStart"/>
       <w:r>
         <w:rPr>
           <w:sz w:val="20"/>
           <w:szCs w:val="20"/>
         </w:rPr>
-        <w:t>&gt;[</w:t>
-      </w:r>
-      <w:proofErr w:type="gramEnd"/>
+        <w:t>Backend</w:t>
+      </w:r>
+      <w:proofErr w:type="spellEnd"/>
       <w:r>
         <w:rPr>
           <w:sz w:val="20"/>
           <w:szCs w:val="20"/>
         </w:rPr>
-        <w:t xml:space="preserve"> API REST/</w:t>
+        <w:t xml:space="preserve"> ] &lt; </w:t>
       </w:r>
       <w:proofErr w:type="spellStart"/>
-      <w:proofErr w:type="gramStart"/>
       <w:r>
         <w:rPr>
           <w:sz w:val="20"/>
           <w:szCs w:val="20"/>
         </w:rPr>
-        <w:t>Backend</w:t>
+        <w:t>select,insert,update,delete</w:t>
       </w:r>
       <w:proofErr w:type="spellEnd"/>
       <w:r>
@@ -1099,150 +1046,38 @@
           <w:sz w:val="20"/>
           <w:szCs w:val="20"/>
         </w:rPr>
-        <w:t xml:space="preserve"> ]</w:t>
-      </w:r>
-      <w:proofErr w:type="gramEnd"/>
-      <w:r>
-        <w:rPr>
-          <w:sz w:val="20"/>
-          <w:szCs w:val="20"/>
-        </w:rPr>
-        <w:t xml:space="preserve"> &lt;</w:t>
-      </w:r>
-      <w:r>
-        <w:rPr>
-          <w:sz w:val="20"/>
-          <w:szCs w:val="20"/>
-        </w:rPr>
+        <w:t xml:space="preserve"> &gt; [ BDD ]</w:t>
+      </w:r>
+    </w:p>
+    <w:p>
+      <w:r>
+        <w:t xml:space="preserve">[(CSS/HTML)]                </w:t>
+      </w:r>
+      <w:r>
+        <w:tab/>
+        <w:t xml:space="preserve">   </w:t>
+      </w:r>
+      <w:r>
         <w:t xml:space="preserve"> </w:t>
       </w:r>
-      <w:proofErr w:type="spellStart"/>
-      <w:proofErr w:type="gramStart"/>
-      <w:r>
-        <w:rPr>
-          <w:sz w:val="20"/>
-          <w:szCs w:val="20"/>
-        </w:rPr>
-        <w:t>select,insert</w:t>
-      </w:r>
-      <w:proofErr w:type="gramEnd"/>
-      <w:r>
-        <w:rPr>
-          <w:sz w:val="20"/>
-          <w:szCs w:val="20"/>
-        </w:rPr>
-        <w:t>,</w:t>
-      </w:r>
-      <w:proofErr w:type="gramStart"/>
-      <w:r>
-        <w:rPr>
-          <w:sz w:val="20"/>
-          <w:szCs w:val="20"/>
-        </w:rPr>
-        <w:t>update,delete</w:t>
-      </w:r>
-      <w:proofErr w:type="spellEnd"/>
-      <w:proofErr w:type="gramEnd"/>
-      <w:r>
-        <w:rPr>
-          <w:sz w:val="20"/>
-          <w:szCs w:val="20"/>
-        </w:rPr>
-        <w:t xml:space="preserve"> &gt; [ </w:t>
-      </w:r>
-      <w:proofErr w:type="gramStart"/>
-      <w:r>
-        <w:rPr>
-          <w:sz w:val="20"/>
-          <w:szCs w:val="20"/>
-        </w:rPr>
-        <w:t>BD</w:t>
-      </w:r>
-      <w:r>
-        <w:rPr>
-          <w:sz w:val="20"/>
-          <w:szCs w:val="20"/>
-        </w:rPr>
-        <w:t>D</w:t>
-      </w:r>
-      <w:r>
-        <w:rPr>
-          <w:sz w:val="20"/>
-          <w:szCs w:val="20"/>
-        </w:rPr>
-        <w:t xml:space="preserve"> ]</w:t>
-      </w:r>
-      <w:proofErr w:type="gramEnd"/>
-    </w:p>
-    <w:p>
-      <w:r>
-        <w:t>[</w:t>
-      </w:r>
-      <w:r>
-        <w:t>(</w:t>
-      </w:r>
-      <w:r>
-        <w:t>CSS</w:t>
-      </w:r>
-      <w:r>
-        <w:t>/HTML)</w:t>
-      </w:r>
-      <w:r>
-        <w:t>]</w:t>
-      </w:r>
-      <w:r>
-        <w:t xml:space="preserve">                </w:t>
+      <w:r>
+        <w:t xml:space="preserve"> [Python </w:t>
+      </w:r>
+      <w:r>
+        <w:t>F</w:t>
+      </w:r>
+      <w:r>
+        <w:t xml:space="preserve">lask]        </w:t>
       </w:r>
       <w:r>
         <w:tab/>
-        <w:t xml:space="preserve">  </w:t>
-      </w:r>
-      <w:proofErr w:type="gramStart"/>
-      <w:r>
-        <w:t xml:space="preserve"> </w:t>
-      </w:r>
-      <w:r>
-        <w:t xml:space="preserve"> </w:t>
-      </w:r>
-      <w:r>
-        <w:t xml:space="preserve"> [</w:t>
-      </w:r>
-      <w:proofErr w:type="gramEnd"/>
-      <w:r>
-        <w:t>Python</w:t>
-      </w:r>
-      <w:r>
-        <w:t xml:space="preserve"> </w:t>
-      </w:r>
-      <w:r>
-        <w:t>F</w:t>
-      </w:r>
-      <w:r>
-        <w:t>lask]</w:t>
-      </w:r>
-      <w:r>
-        <w:t xml:space="preserve">        </w:t>
       </w:r>
       <w:r>
         <w:tab/>
       </w:r>
       <w:r>
         <w:tab/>
-      </w:r>
-      <w:r>
-        <w:tab/>
-        <w:t xml:space="preserve">                 </w:t>
-      </w:r>
-      <w:proofErr w:type="gramStart"/>
-      <w:r>
-        <w:t xml:space="preserve">   [</w:t>
-      </w:r>
-      <w:proofErr w:type="gramEnd"/>
-      <w:r>
-        <w:t>MySQL</w:t>
-      </w:r>
-      <w:r>
-        <w:t>]</w:t>
+        <w:t xml:space="preserve">                    [MySQL]</w:t>
       </w:r>
     </w:p>
     <w:p>
@@ -1560,23 +1395,7 @@
       </w:r>
       <w:proofErr w:type="spellEnd"/>
       <w:r>
-        <w:t xml:space="preserve"> genera un código con el formato [A-Z</w:t>
-      </w:r>
-      <w:proofErr w:type="gramStart"/>
-      <w:r>
-        <w:t>][</w:t>
-      </w:r>
-      <w:proofErr w:type="gramEnd"/>
-      <w:r>
-        <w:t>0-9</w:t>
-      </w:r>
-      <w:proofErr w:type="gramStart"/>
-      <w:r>
-        <w:t>][</w:t>
-      </w:r>
-      <w:proofErr w:type="gramEnd"/>
-      <w:r>
-        <w:t>0-9] (ej. A12, B99).</w:t>
+        <w:t xml:space="preserve"> genera un código con el formato [A-Z][0-9][0-9] (ej. A12, B99).</w:t>
       </w:r>
     </w:p>
     <w:p>
@@ -1692,6 +1511,9 @@
     </w:p>
     <w:p>
       <w:r>
+        <w:rPr>
+          <w:noProof/>
+        </w:rPr>
         <w:drawing>
           <wp:inline distT="0" distB="0" distL="0" distR="0" wp14:anchorId="0512A086" wp14:editId="7E65AB91">
             <wp:extent cx="5612130" cy="1221740"/>
@@ -1731,6 +1553,9 @@
     </w:p>
     <w:p>
       <w:r>
+        <w:rPr>
+          <w:noProof/>
+        </w:rPr>
         <w:drawing>
           <wp:inline distT="0" distB="0" distL="0" distR="0" wp14:anchorId="0F462CE2" wp14:editId="432ED33A">
             <wp:extent cx="5612130" cy="712470"/>
@@ -1780,21 +1605,7 @@
           <w:b/>
           <w:bCs/>
         </w:rPr>
-        <w:t>T</w:t>
-      </w:r>
-      <w:r>
-        <w:rPr>
-          <w:b/>
-          <w:bCs/>
-        </w:rPr>
-        <w:t>ecnológico Sugerid</w:t>
-      </w:r>
-      <w:r>
-        <w:rPr>
-          <w:b/>
-          <w:bCs/>
-        </w:rPr>
-        <w:t>a</w:t>
+        <w:t>Tecnológico Sugerida</w:t>
       </w:r>
     </w:p>
     <w:p>
@@ -1890,7 +1701,6 @@
         </w:rPr>
         <w:t xml:space="preserve">4 </w:t>
       </w:r>
-      <w:proofErr w:type="gramStart"/>
       <w:r>
         <w:rPr>
           <w:b/>
@@ -1905,7 +1715,6 @@
         </w:rPr>
         <w:t>ocumentación</w:t>
       </w:r>
-      <w:proofErr w:type="gramEnd"/>
       <w:r>
         <w:rPr>
           <w:b/>
@@ -1922,8 +1731,595 @@
           <w:bCs/>
         </w:rPr>
       </w:pPr>
-    </w:p>
-    <w:p/>
+      <w:r>
+        <w:rPr>
+          <w:b/>
+          <w:bCs/>
+        </w:rPr>
+        <w:t>Entrada de Datos</w:t>
+      </w:r>
+    </w:p>
+    <w:p>
+      <w:pPr>
+        <w:jc w:val="both"/>
+      </w:pPr>
+      <w:r>
+        <w:t>4.</w:t>
+      </w:r>
+      <w:r>
+        <w:t>1. Formulario de Registro (</w:t>
+      </w:r>
+      <w:proofErr w:type="spellStart"/>
+      <w:r>
+        <w:t>Create</w:t>
+      </w:r>
+      <w:proofErr w:type="spellEnd"/>
+      <w:r>
+        <w:t>)</w:t>
+      </w:r>
+    </w:p>
+    <w:p>
+      <w:pPr>
+        <w:numPr>
+          <w:ilvl w:val="0"/>
+          <w:numId w:val="11"/>
+        </w:numPr>
+        <w:jc w:val="both"/>
+      </w:pPr>
+      <w:r>
+        <w:t>Título: Campo de texto libre (Input Text).</w:t>
+      </w:r>
+    </w:p>
+    <w:p>
+      <w:pPr>
+        <w:numPr>
+          <w:ilvl w:val="0"/>
+          <w:numId w:val="11"/>
+        </w:numPr>
+        <w:jc w:val="both"/>
+      </w:pPr>
+      <w:r>
+        <w:t>Autor: Campo de texto libre (Input Text).</w:t>
+      </w:r>
+    </w:p>
+    <w:p>
+      <w:pPr>
+        <w:numPr>
+          <w:ilvl w:val="0"/>
+          <w:numId w:val="11"/>
+        </w:numPr>
+        <w:jc w:val="both"/>
+      </w:pPr>
+      <w:r>
+        <w:t>Género: Lista desplegable (</w:t>
+      </w:r>
+      <w:proofErr w:type="spellStart"/>
+      <w:r>
+        <w:t>Select</w:t>
+      </w:r>
+      <w:proofErr w:type="spellEnd"/>
+      <w:r>
+        <w:t xml:space="preserve">) </w:t>
+      </w:r>
+      <w:r>
+        <w:t>de preferencia</w:t>
+      </w:r>
+      <w:r>
+        <w:t>.</w:t>
+      </w:r>
+    </w:p>
+    <w:p>
+      <w:pPr>
+        <w:numPr>
+          <w:ilvl w:val="0"/>
+          <w:numId w:val="11"/>
+        </w:numPr>
+        <w:jc w:val="both"/>
+      </w:pPr>
+      <w:r>
+        <w:t xml:space="preserve">Año de publicación: Campo </w:t>
+      </w:r>
+      <w:proofErr w:type="spellStart"/>
+      <w:r>
+        <w:t>fehca</w:t>
+      </w:r>
+      <w:proofErr w:type="spellEnd"/>
+      <w:r>
+        <w:t>.</w:t>
+      </w:r>
+    </w:p>
+    <w:p>
+      <w:pPr>
+        <w:numPr>
+          <w:ilvl w:val="0"/>
+          <w:numId w:val="11"/>
+        </w:numPr>
+        <w:jc w:val="both"/>
+      </w:pPr>
+      <w:r>
+        <w:t xml:space="preserve">Botón: </w:t>
+      </w:r>
+      <w:r>
+        <w:rPr>
+          <w:i/>
+          <w:iCs/>
+        </w:rPr>
+        <w:t>"</w:t>
+      </w:r>
+      <w:r>
+        <w:rPr>
+          <w:i/>
+          <w:iCs/>
+        </w:rPr>
+        <w:t>Crear</w:t>
+      </w:r>
+      <w:r>
+        <w:rPr>
+          <w:i/>
+          <w:iCs/>
+        </w:rPr>
+        <w:t xml:space="preserve"> Libro"</w:t>
+      </w:r>
+      <w:r>
+        <w:t>.</w:t>
+      </w:r>
+    </w:p>
+    <w:p>
+      <w:pPr>
+        <w:jc w:val="both"/>
+      </w:pPr>
+      <w:r>
+        <w:t xml:space="preserve">Nota sobre el Código Único: No requiere un campo de entrada. Debe ser generado automáticamente en el </w:t>
+      </w:r>
+      <w:proofErr w:type="spellStart"/>
+      <w:r>
+        <w:rPr>
+          <w:i/>
+          <w:iCs/>
+        </w:rPr>
+        <w:t>backend</w:t>
+      </w:r>
+      <w:proofErr w:type="spellEnd"/>
+      <w:r>
+        <w:t xml:space="preserve"> usando la lógica solicitada ([A-Z][0-9][0-9]) antes de insertarlo en MySQL.</w:t>
+      </w:r>
+    </w:p>
+    <w:p>
+      <w:pPr>
+        <w:jc w:val="both"/>
+      </w:pPr>
+      <w:r>
+        <w:t>4.</w:t>
+      </w:r>
+      <w:r>
+        <w:t xml:space="preserve">2. </w:t>
+      </w:r>
+      <w:r>
+        <w:t>Campo</w:t>
+      </w:r>
+      <w:r>
+        <w:t xml:space="preserve"> de Búsqueda  (Read)</w:t>
+      </w:r>
+    </w:p>
+    <w:p>
+      <w:pPr>
+        <w:numPr>
+          <w:ilvl w:val="0"/>
+          <w:numId w:val="12"/>
+        </w:numPr>
+        <w:jc w:val="both"/>
+      </w:pPr>
+      <w:r>
+        <w:t>Campos</w:t>
+      </w:r>
+      <w:r>
+        <w:t xml:space="preserve"> de Búsqueda: Campo de texto (Input Text) para buscar por Código, Título, Autor o Género.</w:t>
+      </w:r>
+    </w:p>
+    <w:p>
+      <w:pPr>
+        <w:numPr>
+          <w:ilvl w:val="0"/>
+          <w:numId w:val="12"/>
+        </w:numPr>
+        <w:jc w:val="both"/>
+      </w:pPr>
+      <w:r>
+        <w:t xml:space="preserve">Botón/Acción: </w:t>
+      </w:r>
+      <w:r>
+        <w:rPr>
+          <w:i/>
+          <w:iCs/>
+        </w:rPr>
+        <w:t>"Buscar"</w:t>
+      </w:r>
+      <w:r>
+        <w:t xml:space="preserve"> </w:t>
+      </w:r>
+    </w:p>
+    <w:p>
+      <w:pPr>
+        <w:jc w:val="both"/>
+      </w:pPr>
+      <w:r>
+        <w:t>4.</w:t>
+      </w:r>
+      <w:r>
+        <w:t>3. Formulario de Edición (</w:t>
+      </w:r>
+      <w:proofErr w:type="spellStart"/>
+      <w:r>
+        <w:t>Update</w:t>
+      </w:r>
+      <w:proofErr w:type="spellEnd"/>
+      <w:r>
+        <w:t>)</w:t>
+      </w:r>
+    </w:p>
+    <w:p>
+      <w:pPr>
+        <w:numPr>
+          <w:ilvl w:val="0"/>
+          <w:numId w:val="13"/>
+        </w:numPr>
+        <w:jc w:val="both"/>
+      </w:pPr>
+      <w:r>
+        <w:t>Identificador Único (Code): Campo oculto</w:t>
+      </w:r>
+      <w:r>
+        <w:t xml:space="preserve"> solo</w:t>
+      </w:r>
+      <w:r>
+        <w:t xml:space="preserve"> como referencia visual para saber qué libro se edita.</w:t>
+      </w:r>
+    </w:p>
+    <w:p>
+      <w:pPr>
+        <w:numPr>
+          <w:ilvl w:val="0"/>
+          <w:numId w:val="13"/>
+        </w:numPr>
+        <w:jc w:val="both"/>
+      </w:pPr>
+      <w:r>
+        <w:t>Campos Editables:</w:t>
+      </w:r>
+    </w:p>
+    <w:p>
+      <w:pPr>
+        <w:numPr>
+          <w:ilvl w:val="1"/>
+          <w:numId w:val="13"/>
+        </w:numPr>
+        <w:jc w:val="both"/>
+      </w:pPr>
+      <w:r>
+        <w:t>Título (Input Text)</w:t>
+      </w:r>
+    </w:p>
+    <w:p>
+      <w:pPr>
+        <w:numPr>
+          <w:ilvl w:val="1"/>
+          <w:numId w:val="13"/>
+        </w:numPr>
+        <w:jc w:val="both"/>
+      </w:pPr>
+      <w:r>
+        <w:t>Autor (Input Text)</w:t>
+      </w:r>
+    </w:p>
+    <w:p>
+      <w:pPr>
+        <w:numPr>
+          <w:ilvl w:val="1"/>
+          <w:numId w:val="13"/>
+        </w:numPr>
+        <w:jc w:val="both"/>
+      </w:pPr>
+      <w:r>
+        <w:t>Género (</w:t>
+      </w:r>
+      <w:proofErr w:type="spellStart"/>
+      <w:r>
+        <w:t>Select</w:t>
+      </w:r>
+      <w:proofErr w:type="spellEnd"/>
+      <w:r>
+        <w:t>)</w:t>
+      </w:r>
+    </w:p>
+    <w:p>
+      <w:pPr>
+        <w:numPr>
+          <w:ilvl w:val="1"/>
+          <w:numId w:val="13"/>
+        </w:numPr>
+        <w:jc w:val="both"/>
+      </w:pPr>
+      <w:r>
+        <w:lastRenderedPageBreak/>
+        <w:t>Año de publicación (</w:t>
+      </w:r>
+      <w:r>
+        <w:t>Fecha</w:t>
+      </w:r>
+      <w:r>
+        <w:t>)</w:t>
+      </w:r>
+    </w:p>
+    <w:p>
+      <w:pPr>
+        <w:numPr>
+          <w:ilvl w:val="0"/>
+          <w:numId w:val="13"/>
+        </w:numPr>
+        <w:jc w:val="both"/>
+      </w:pPr>
+      <w:r>
+        <w:t xml:space="preserve">Botón: </w:t>
+      </w:r>
+      <w:r>
+        <w:rPr>
+          <w:i/>
+          <w:iCs/>
+        </w:rPr>
+        <w:t>"Actualizar</w:t>
+      </w:r>
+      <w:r>
+        <w:rPr>
+          <w:i/>
+          <w:iCs/>
+        </w:rPr>
+        <w:t xml:space="preserve"> Libro</w:t>
+      </w:r>
+      <w:r>
+        <w:rPr>
+          <w:i/>
+          <w:iCs/>
+        </w:rPr>
+        <w:t>"</w:t>
+      </w:r>
+      <w:r>
+        <w:t>.</w:t>
+      </w:r>
+    </w:p>
+    <w:p>
+      <w:pPr>
+        <w:jc w:val="both"/>
+      </w:pPr>
+      <w:r>
+        <w:t>4.</w:t>
+      </w:r>
+      <w:r>
+        <w:t>4. Confirmación de Eliminación (Delete)</w:t>
+      </w:r>
+    </w:p>
+    <w:p>
+      <w:pPr>
+        <w:numPr>
+          <w:ilvl w:val="0"/>
+          <w:numId w:val="14"/>
+        </w:numPr>
+        <w:jc w:val="both"/>
+      </w:pPr>
+      <w:r>
+        <w:t>Identificador Único (Code): Se pasa implícitamente al seleccionar el libro desde la tabla.</w:t>
+      </w:r>
+    </w:p>
+    <w:p>
+      <w:pPr>
+        <w:numPr>
+          <w:ilvl w:val="0"/>
+          <w:numId w:val="14"/>
+        </w:numPr>
+        <w:jc w:val="both"/>
+      </w:pPr>
+      <w:r>
+        <w:t>Ventana emergente con mensaje de confirmación (¿Desea eliminar el libro?).</w:t>
+      </w:r>
+    </w:p>
+    <w:p>
+      <w:pPr>
+        <w:jc w:val="both"/>
+      </w:pPr>
+    </w:p>
+    <w:p>
+      <w:r>
+        <w:t xml:space="preserve">Aquí tienes los </w:t>
+      </w:r>
+      <w:r>
+        <w:rPr>
+          <w:b/>
+          <w:bCs/>
+        </w:rPr>
+        <w:t>componentes de salida de datos</w:t>
+      </w:r>
+      <w:r>
+        <w:t xml:space="preserve"> que el sistema debe mostrar al usuario, explicados de forma breve y clara:</w:t>
+      </w:r>
+    </w:p>
+    <w:p>
+      <w:pPr>
+        <w:jc w:val="both"/>
+        <w:rPr>
+          <w:b/>
+          <w:bCs/>
+        </w:rPr>
+      </w:pPr>
+      <w:r>
+        <w:rPr>
+          <w:b/>
+          <w:bCs/>
+        </w:rPr>
+        <w:t>Salida</w:t>
+      </w:r>
+      <w:r>
+        <w:rPr>
+          <w:b/>
+          <w:bCs/>
+        </w:rPr>
+        <w:t xml:space="preserve"> de Datos</w:t>
+      </w:r>
+    </w:p>
+    <w:p>
+      <w:pPr>
+        <w:pStyle w:val="Prrafodelista"/>
+        <w:numPr>
+          <w:ilvl w:val="1"/>
+          <w:numId w:val="20"/>
+        </w:numPr>
+      </w:pPr>
+      <w:r>
+        <w:rPr>
+          <w:b/>
+          <w:bCs/>
+        </w:rPr>
+        <w:t>Vista Lista:</w:t>
+      </w:r>
+      <w:r>
+        <w:t xml:space="preserve"> Muestra todos los libros almacenados con sus columnas principales:</w:t>
+      </w:r>
+    </w:p>
+    <w:p>
+      <w:pPr>
+        <w:numPr>
+          <w:ilvl w:val="1"/>
+          <w:numId w:val="15"/>
+        </w:numPr>
+      </w:pPr>
+      <w:r>
+        <w:rPr>
+          <w:b/>
+          <w:bCs/>
+        </w:rPr>
+        <w:t xml:space="preserve">ID </w:t>
+      </w:r>
+      <w:r>
+        <w:t>(</w:t>
+      </w:r>
+      <w:proofErr w:type="spellStart"/>
+      <w:r>
+        <w:t>bdd</w:t>
+      </w:r>
+      <w:proofErr w:type="spellEnd"/>
+      <w:r>
+        <w:t>)</w:t>
+      </w:r>
+    </w:p>
+    <w:p>
+      <w:pPr>
+        <w:numPr>
+          <w:ilvl w:val="1"/>
+          <w:numId w:val="15"/>
+        </w:numPr>
+      </w:pPr>
+      <w:r>
+        <w:rPr>
+          <w:b/>
+          <w:bCs/>
+        </w:rPr>
+        <w:t>Código generado</w:t>
+      </w:r>
+      <w:r>
+        <w:t xml:space="preserve"> (Ej. </w:t>
+      </w:r>
+      <w:r>
+        <w:rPr>
+          <w:i/>
+          <w:iCs/>
+        </w:rPr>
+        <w:t>A12</w:t>
+      </w:r>
+      <w:r>
+        <w:t xml:space="preserve">, </w:t>
+      </w:r>
+      <w:r>
+        <w:rPr>
+          <w:i/>
+          <w:iCs/>
+        </w:rPr>
+        <w:t>B45</w:t>
+      </w:r>
+      <w:r>
+        <w:t>)</w:t>
+      </w:r>
+    </w:p>
+    <w:p>
+      <w:pPr>
+        <w:numPr>
+          <w:ilvl w:val="1"/>
+          <w:numId w:val="15"/>
+        </w:numPr>
+      </w:pPr>
+      <w:r>
+        <w:t>Título</w:t>
+      </w:r>
+    </w:p>
+    <w:p>
+      <w:pPr>
+        <w:numPr>
+          <w:ilvl w:val="1"/>
+          <w:numId w:val="15"/>
+        </w:numPr>
+      </w:pPr>
+      <w:r>
+        <w:t>Autor</w:t>
+      </w:r>
+    </w:p>
+    <w:p>
+      <w:pPr>
+        <w:numPr>
+          <w:ilvl w:val="1"/>
+          <w:numId w:val="15"/>
+        </w:numPr>
+      </w:pPr>
+      <w:r>
+        <w:t>Género</w:t>
+      </w:r>
+    </w:p>
+    <w:p>
+      <w:pPr>
+        <w:numPr>
+          <w:ilvl w:val="1"/>
+          <w:numId w:val="15"/>
+        </w:numPr>
+      </w:pPr>
+      <w:r>
+        <w:t>Año de publicación</w:t>
+      </w:r>
+    </w:p>
+    <w:p>
+      <w:pPr>
+        <w:numPr>
+          <w:ilvl w:val="1"/>
+          <w:numId w:val="15"/>
+        </w:numPr>
+      </w:pPr>
+      <w:r>
+        <w:rPr>
+          <w:b/>
+          <w:bCs/>
+        </w:rPr>
+        <w:t>Acciones por Fila:</w:t>
+      </w:r>
+      <w:r>
+        <w:t xml:space="preserve"> Botones </w:t>
+      </w:r>
+      <w:r>
+        <w:t>para Editar y Eliminar</w:t>
+      </w:r>
+      <w:r>
+        <w:t xml:space="preserve"> </w:t>
+      </w:r>
+    </w:p>
+    <w:p>
+      <w:pPr>
+        <w:ind w:left="1440"/>
+      </w:pPr>
+    </w:p>
     <w:p/>
     <w:sectPr>
       <w:pgSz w:w="12240" w:h="15840"/>
@@ -1938,6 +2334,304 @@
 <file path=word/numbering.xml><?xml version="1.0" encoding="utf-8"?>
 <w:numbering xmlns:wpc="http://schemas.microsoft.com/office/word/2010/wordprocessingCanvas" xmlns:cx="http://schemas.microsoft.com/office/drawing/2014/chartex" xmlns:cx1="http://schemas.microsoft.com/office/drawing/2015/9/8/chartex" xmlns:cx2="http://schemas.microsoft.com/office/drawing/2015/10/21/chartex" xmlns:cx3="http://schemas.microsoft.com/office/drawing/2016/5/9/chartex" xmlns:cx4="http://schemas.microsoft.com/office/drawing/2016/5/10/chartex" xmlns:cx5="http://schemas.microsoft.com/office/drawing/2016/5/11/chartex" xmlns:cx6="http://schemas.microsoft.com/office/drawing/2016/5/12/chartex" xmlns:cx7="http://schemas.microsoft.com/office/drawing/2016/5/13/chartex" xmlns:cx8="http://schemas.microsoft.com/office/drawing/2016/5/14/chartex" xmlns:mc="http://schemas.openxmlformats.org/markup-compatibility/2006" xmlns:aink="http://schemas.microsoft.com/office/drawing/2016/ink" xmlns:am3d="http://schemas.microsoft.com/office/drawing/2017/model3d" xmlns:o="urn:schemas-microsoft-com:office:office" xmlns:oel="http://schemas.microsoft.com/office/2019/extlst" xmlns:r="http://schemas.openxmlformats.org/officeDocument/2006/relationships" xmlns:m="http://schemas.openxmlformats.org/officeDocument/2006/math" xmlns:v="urn:schemas-microsoft-com:vml" xmlns:wp14="http://schemas.microsoft.com/office/word/2010/wordprocessingDrawing" xmlns:wp="http://schemas.openxmlformats.org/drawingml/2006/wordprocessingDrawing" xmlns:w10="urn:schemas-microsoft-com:office:word" xmlns:w="http://schemas.openxmlformats.org/wordprocessingml/2006/main" xmlns:w14="http://schemas.microsoft.com/office/word/2010/wordml" xmlns:w15="http://schemas.microsoft.com/office/word/2012/wordml" xmlns:w16cex="http://schemas.microsoft.com/office/word/2018/wordml/cex" xmlns:w16cid="http://schemas.microsoft.com/office/word/2016/wordml/cid" xmlns:w16="http://schemas.microsoft.com/office/word/2018/wordml" xmlns:w16du="http://schemas.microsoft.com/office/word/2023/wordml/word16du" xmlns:w16sdtdh="http://schemas.microsoft.com/office/word/2020/wordml/sdtdatahash" xmlns:w16sdtfl="http://schemas.microsoft.com/office/word/2024/wordml/sdtformatlock" xmlns:w16se="http://schemas.microsoft.com/office/word/2015/wordml/symex" xmlns:wpg="http://schemas.microsoft.com/office/word/2010/wordprocessingGroup" xmlns:wpi="http://schemas.microsoft.com/office/word/2010/wordprocessingInk" xmlns:wne="http://schemas.microsoft.com/office/word/2006/wordml" xmlns:wps="http://schemas.microsoft.com/office/word/2010/wordprocessingShape" mc:Ignorable="w14 w15 w16se w16cid w16 w16cex w16sdtdh w16sdtfl w16du wp14">
   <w:abstractNum w:abstractNumId="0" w15:restartNumberingAfterBreak="0">
+    <w:nsid w:val="0B4F05BD"/>
+    <w:multiLevelType w:val="multilevel"/>
+    <w:tmpl w:val="897E4B9C"/>
+    <w:lvl w:ilvl="0">
+      <w:start w:val="1"/>
+      <w:numFmt w:val="bullet"/>
+      <w:lvlText w:val=""/>
+      <w:lvlJc w:val="left"/>
+      <w:pPr>
+        <w:tabs>
+          <w:tab w:val="num" w:pos="720"/>
+        </w:tabs>
+        <w:ind w:left="720" w:hanging="360"/>
+      </w:pPr>
+      <w:rPr>
+        <w:rFonts w:ascii="Symbol" w:hAnsi="Symbol" w:hint="default"/>
+        <w:sz w:val="20"/>
+      </w:rPr>
+    </w:lvl>
+    <w:lvl w:ilvl="1">
+      <w:start w:val="1"/>
+      <w:numFmt w:val="bullet"/>
+      <w:lvlText w:val="o"/>
+      <w:lvlJc w:val="left"/>
+      <w:pPr>
+        <w:tabs>
+          <w:tab w:val="num" w:pos="1440"/>
+        </w:tabs>
+        <w:ind w:left="1440" w:hanging="360"/>
+      </w:pPr>
+      <w:rPr>
+        <w:rFonts w:ascii="Courier New" w:hAnsi="Courier New" w:hint="default"/>
+        <w:sz w:val="20"/>
+      </w:rPr>
+    </w:lvl>
+    <w:lvl w:ilvl="2" w:tentative="1">
+      <w:start w:val="1"/>
+      <w:numFmt w:val="bullet"/>
+      <w:lvlText w:val=""/>
+      <w:lvlJc w:val="left"/>
+      <w:pPr>
+        <w:tabs>
+          <w:tab w:val="num" w:pos="2160"/>
+        </w:tabs>
+        <w:ind w:left="2160" w:hanging="360"/>
+      </w:pPr>
+      <w:rPr>
+        <w:rFonts w:ascii="Wingdings" w:hAnsi="Wingdings" w:hint="default"/>
+        <w:sz w:val="20"/>
+      </w:rPr>
+    </w:lvl>
+    <w:lvl w:ilvl="3" w:tentative="1">
+      <w:start w:val="1"/>
+      <w:numFmt w:val="bullet"/>
+      <w:lvlText w:val=""/>
+      <w:lvlJc w:val="left"/>
+      <w:pPr>
+        <w:tabs>
+          <w:tab w:val="num" w:pos="2880"/>
+        </w:tabs>
+        <w:ind w:left="2880" w:hanging="360"/>
+      </w:pPr>
+      <w:rPr>
+        <w:rFonts w:ascii="Wingdings" w:hAnsi="Wingdings" w:hint="default"/>
+        <w:sz w:val="20"/>
+      </w:rPr>
+    </w:lvl>
+    <w:lvl w:ilvl="4" w:tentative="1">
+      <w:start w:val="1"/>
+      <w:numFmt w:val="bullet"/>
+      <w:lvlText w:val=""/>
+      <w:lvlJc w:val="left"/>
+      <w:pPr>
+        <w:tabs>
+          <w:tab w:val="num" w:pos="3600"/>
+        </w:tabs>
+        <w:ind w:left="3600" w:hanging="360"/>
+      </w:pPr>
+      <w:rPr>
+        <w:rFonts w:ascii="Wingdings" w:hAnsi="Wingdings" w:hint="default"/>
+        <w:sz w:val="20"/>
+      </w:rPr>
+    </w:lvl>
+    <w:lvl w:ilvl="5" w:tentative="1">
+      <w:start w:val="1"/>
+      <w:numFmt w:val="bullet"/>
+      <w:lvlText w:val=""/>
+      <w:lvlJc w:val="left"/>
+      <w:pPr>
+        <w:tabs>
+          <w:tab w:val="num" w:pos="4320"/>
+        </w:tabs>
+        <w:ind w:left="4320" w:hanging="360"/>
+      </w:pPr>
+      <w:rPr>
+        <w:rFonts w:ascii="Wingdings" w:hAnsi="Wingdings" w:hint="default"/>
+        <w:sz w:val="20"/>
+      </w:rPr>
+    </w:lvl>
+    <w:lvl w:ilvl="6" w:tentative="1">
+      <w:start w:val="1"/>
+      <w:numFmt w:val="bullet"/>
+      <w:lvlText w:val=""/>
+      <w:lvlJc w:val="left"/>
+      <w:pPr>
+        <w:tabs>
+          <w:tab w:val="num" w:pos="5040"/>
+        </w:tabs>
+        <w:ind w:left="5040" w:hanging="360"/>
+      </w:pPr>
+      <w:rPr>
+        <w:rFonts w:ascii="Wingdings" w:hAnsi="Wingdings" w:hint="default"/>
+        <w:sz w:val="20"/>
+      </w:rPr>
+    </w:lvl>
+    <w:lvl w:ilvl="7" w:tentative="1">
+      <w:start w:val="1"/>
+      <w:numFmt w:val="bullet"/>
+      <w:lvlText w:val=""/>
+      <w:lvlJc w:val="left"/>
+      <w:pPr>
+        <w:tabs>
+          <w:tab w:val="num" w:pos="5760"/>
+        </w:tabs>
+        <w:ind w:left="5760" w:hanging="360"/>
+      </w:pPr>
+      <w:rPr>
+        <w:rFonts w:ascii="Wingdings" w:hAnsi="Wingdings" w:hint="default"/>
+        <w:sz w:val="20"/>
+      </w:rPr>
+    </w:lvl>
+    <w:lvl w:ilvl="8" w:tentative="1">
+      <w:start w:val="1"/>
+      <w:numFmt w:val="bullet"/>
+      <w:lvlText w:val=""/>
+      <w:lvlJc w:val="left"/>
+      <w:pPr>
+        <w:tabs>
+          <w:tab w:val="num" w:pos="6480"/>
+        </w:tabs>
+        <w:ind w:left="6480" w:hanging="360"/>
+      </w:pPr>
+      <w:rPr>
+        <w:rFonts w:ascii="Wingdings" w:hAnsi="Wingdings" w:hint="default"/>
+        <w:sz w:val="20"/>
+      </w:rPr>
+    </w:lvl>
+  </w:abstractNum>
+  <w:abstractNum w:abstractNumId="1" w15:restartNumberingAfterBreak="0">
+    <w:nsid w:val="0BC11438"/>
+    <w:multiLevelType w:val="multilevel"/>
+    <w:tmpl w:val="9BA80960"/>
+    <w:lvl w:ilvl="0">
+      <w:start w:val="1"/>
+      <w:numFmt w:val="bullet"/>
+      <w:lvlText w:val=""/>
+      <w:lvlJc w:val="left"/>
+      <w:pPr>
+        <w:tabs>
+          <w:tab w:val="num" w:pos="720"/>
+        </w:tabs>
+        <w:ind w:left="720" w:hanging="360"/>
+      </w:pPr>
+      <w:rPr>
+        <w:rFonts w:ascii="Symbol" w:hAnsi="Symbol" w:hint="default"/>
+        <w:sz w:val="20"/>
+      </w:rPr>
+    </w:lvl>
+    <w:lvl w:ilvl="1" w:tentative="1">
+      <w:start w:val="1"/>
+      <w:numFmt w:val="bullet"/>
+      <w:lvlText w:val="o"/>
+      <w:lvlJc w:val="left"/>
+      <w:pPr>
+        <w:tabs>
+          <w:tab w:val="num" w:pos="1440"/>
+        </w:tabs>
+        <w:ind w:left="1440" w:hanging="360"/>
+      </w:pPr>
+      <w:rPr>
+        <w:rFonts w:ascii="Courier New" w:hAnsi="Courier New" w:hint="default"/>
+        <w:sz w:val="20"/>
+      </w:rPr>
+    </w:lvl>
+    <w:lvl w:ilvl="2" w:tentative="1">
+      <w:start w:val="1"/>
+      <w:numFmt w:val="bullet"/>
+      <w:lvlText w:val=""/>
+      <w:lvlJc w:val="left"/>
+      <w:pPr>
+        <w:tabs>
+          <w:tab w:val="num" w:pos="2160"/>
+        </w:tabs>
+        <w:ind w:left="2160" w:hanging="360"/>
+      </w:pPr>
+      <w:rPr>
+        <w:rFonts w:ascii="Wingdings" w:hAnsi="Wingdings" w:hint="default"/>
+        <w:sz w:val="20"/>
+      </w:rPr>
+    </w:lvl>
+    <w:lvl w:ilvl="3" w:tentative="1">
+      <w:start w:val="1"/>
+      <w:numFmt w:val="bullet"/>
+      <w:lvlText w:val=""/>
+      <w:lvlJc w:val="left"/>
+      <w:pPr>
+        <w:tabs>
+          <w:tab w:val="num" w:pos="2880"/>
+        </w:tabs>
+        <w:ind w:left="2880" w:hanging="360"/>
+      </w:pPr>
+      <w:rPr>
+        <w:rFonts w:ascii="Wingdings" w:hAnsi="Wingdings" w:hint="default"/>
+        <w:sz w:val="20"/>
+      </w:rPr>
+    </w:lvl>
+    <w:lvl w:ilvl="4" w:tentative="1">
+      <w:start w:val="1"/>
+      <w:numFmt w:val="bullet"/>
+      <w:lvlText w:val=""/>
+      <w:lvlJc w:val="left"/>
+      <w:pPr>
+        <w:tabs>
+          <w:tab w:val="num" w:pos="3600"/>
+        </w:tabs>
+        <w:ind w:left="3600" w:hanging="360"/>
+      </w:pPr>
+      <w:rPr>
+        <w:rFonts w:ascii="Wingdings" w:hAnsi="Wingdings" w:hint="default"/>
+        <w:sz w:val="20"/>
+      </w:rPr>
+    </w:lvl>
+    <w:lvl w:ilvl="5" w:tentative="1">
+      <w:start w:val="1"/>
+      <w:numFmt w:val="bullet"/>
+      <w:lvlText w:val=""/>
+      <w:lvlJc w:val="left"/>
+      <w:pPr>
+        <w:tabs>
+          <w:tab w:val="num" w:pos="4320"/>
+        </w:tabs>
+        <w:ind w:left="4320" w:hanging="360"/>
+      </w:pPr>
+      <w:rPr>
+        <w:rFonts w:ascii="Wingdings" w:hAnsi="Wingdings" w:hint="default"/>
+        <w:sz w:val="20"/>
+      </w:rPr>
+    </w:lvl>
+    <w:lvl w:ilvl="6" w:tentative="1">
+      <w:start w:val="1"/>
+      <w:numFmt w:val="bullet"/>
+      <w:lvlText w:val=""/>
+      <w:lvlJc w:val="left"/>
+      <w:pPr>
+        <w:tabs>
+          <w:tab w:val="num" w:pos="5040"/>
+        </w:tabs>
+        <w:ind w:left="5040" w:hanging="360"/>
+      </w:pPr>
+      <w:rPr>
+        <w:rFonts w:ascii="Wingdings" w:hAnsi="Wingdings" w:hint="default"/>
+        <w:sz w:val="20"/>
+      </w:rPr>
+    </w:lvl>
+    <w:lvl w:ilvl="7" w:tentative="1">
+      <w:start w:val="1"/>
+      <w:numFmt w:val="bullet"/>
+      <w:lvlText w:val=""/>
+      <w:lvlJc w:val="left"/>
+      <w:pPr>
+        <w:tabs>
+          <w:tab w:val="num" w:pos="5760"/>
+        </w:tabs>
+        <w:ind w:left="5760" w:hanging="360"/>
+      </w:pPr>
+      <w:rPr>
+        <w:rFonts w:ascii="Wingdings" w:hAnsi="Wingdings" w:hint="default"/>
+        <w:sz w:val="20"/>
+      </w:rPr>
+    </w:lvl>
+    <w:lvl w:ilvl="8" w:tentative="1">
+      <w:start w:val="1"/>
+      <w:numFmt w:val="bullet"/>
+      <w:lvlText w:val=""/>
+      <w:lvlJc w:val="left"/>
+      <w:pPr>
+        <w:tabs>
+          <w:tab w:val="num" w:pos="6480"/>
+        </w:tabs>
+        <w:ind w:left="6480" w:hanging="360"/>
+      </w:pPr>
+      <w:rPr>
+        <w:rFonts w:ascii="Wingdings" w:hAnsi="Wingdings" w:hint="default"/>
+        <w:sz w:val="20"/>
+      </w:rPr>
+    </w:lvl>
+  </w:abstractNum>
+  <w:abstractNum w:abstractNumId="2" w15:restartNumberingAfterBreak="0">
     <w:nsid w:val="111F0799"/>
     <w:multiLevelType w:val="multilevel"/>
     <w:tmpl w:val="577E0D6E"/>
@@ -2086,7 +2780,305 @@
       </w:rPr>
     </w:lvl>
   </w:abstractNum>
-  <w:abstractNum w:abstractNumId="1" w15:restartNumberingAfterBreak="0">
+  <w:abstractNum w:abstractNumId="3" w15:restartNumberingAfterBreak="0">
+    <w:nsid w:val="159B04BC"/>
+    <w:multiLevelType w:val="multilevel"/>
+    <w:tmpl w:val="A664F3A8"/>
+    <w:lvl w:ilvl="0">
+      <w:start w:val="1"/>
+      <w:numFmt w:val="bullet"/>
+      <w:lvlText w:val=""/>
+      <w:lvlJc w:val="left"/>
+      <w:pPr>
+        <w:tabs>
+          <w:tab w:val="num" w:pos="720"/>
+        </w:tabs>
+        <w:ind w:left="720" w:hanging="360"/>
+      </w:pPr>
+      <w:rPr>
+        <w:rFonts w:ascii="Symbol" w:hAnsi="Symbol" w:hint="default"/>
+        <w:sz w:val="20"/>
+      </w:rPr>
+    </w:lvl>
+    <w:lvl w:ilvl="1">
+      <w:start w:val="1"/>
+      <w:numFmt w:val="bullet"/>
+      <w:lvlText w:val="o"/>
+      <w:lvlJc w:val="left"/>
+      <w:pPr>
+        <w:tabs>
+          <w:tab w:val="num" w:pos="1440"/>
+        </w:tabs>
+        <w:ind w:left="1440" w:hanging="360"/>
+      </w:pPr>
+      <w:rPr>
+        <w:rFonts w:ascii="Courier New" w:hAnsi="Courier New" w:hint="default"/>
+        <w:sz w:val="20"/>
+      </w:rPr>
+    </w:lvl>
+    <w:lvl w:ilvl="2" w:tentative="1">
+      <w:start w:val="1"/>
+      <w:numFmt w:val="bullet"/>
+      <w:lvlText w:val=""/>
+      <w:lvlJc w:val="left"/>
+      <w:pPr>
+        <w:tabs>
+          <w:tab w:val="num" w:pos="2160"/>
+        </w:tabs>
+        <w:ind w:left="2160" w:hanging="360"/>
+      </w:pPr>
+      <w:rPr>
+        <w:rFonts w:ascii="Wingdings" w:hAnsi="Wingdings" w:hint="default"/>
+        <w:sz w:val="20"/>
+      </w:rPr>
+    </w:lvl>
+    <w:lvl w:ilvl="3" w:tentative="1">
+      <w:start w:val="1"/>
+      <w:numFmt w:val="bullet"/>
+      <w:lvlText w:val=""/>
+      <w:lvlJc w:val="left"/>
+      <w:pPr>
+        <w:tabs>
+          <w:tab w:val="num" w:pos="2880"/>
+        </w:tabs>
+        <w:ind w:left="2880" w:hanging="360"/>
+      </w:pPr>
+      <w:rPr>
+        <w:rFonts w:ascii="Wingdings" w:hAnsi="Wingdings" w:hint="default"/>
+        <w:sz w:val="20"/>
+      </w:rPr>
+    </w:lvl>
+    <w:lvl w:ilvl="4" w:tentative="1">
+      <w:start w:val="1"/>
+      <w:numFmt w:val="bullet"/>
+      <w:lvlText w:val=""/>
+      <w:lvlJc w:val="left"/>
+      <w:pPr>
+        <w:tabs>
+          <w:tab w:val="num" w:pos="3600"/>
+        </w:tabs>
+        <w:ind w:left="3600" w:hanging="360"/>
+      </w:pPr>
+      <w:rPr>
+        <w:rFonts w:ascii="Wingdings" w:hAnsi="Wingdings" w:hint="default"/>
+        <w:sz w:val="20"/>
+      </w:rPr>
+    </w:lvl>
+    <w:lvl w:ilvl="5" w:tentative="1">
+      <w:start w:val="1"/>
+      <w:numFmt w:val="bullet"/>
+      <w:lvlText w:val=""/>
+      <w:lvlJc w:val="left"/>
+      <w:pPr>
+        <w:tabs>
+          <w:tab w:val="num" w:pos="4320"/>
+        </w:tabs>
+        <w:ind w:left="4320" w:hanging="360"/>
+      </w:pPr>
+      <w:rPr>
+        <w:rFonts w:ascii="Wingdings" w:hAnsi="Wingdings" w:hint="default"/>
+        <w:sz w:val="20"/>
+      </w:rPr>
+    </w:lvl>
+    <w:lvl w:ilvl="6" w:tentative="1">
+      <w:start w:val="1"/>
+      <w:numFmt w:val="bullet"/>
+      <w:lvlText w:val=""/>
+      <w:lvlJc w:val="left"/>
+      <w:pPr>
+        <w:tabs>
+          <w:tab w:val="num" w:pos="5040"/>
+        </w:tabs>
+        <w:ind w:left="5040" w:hanging="360"/>
+      </w:pPr>
+      <w:rPr>
+        <w:rFonts w:ascii="Wingdings" w:hAnsi="Wingdings" w:hint="default"/>
+        <w:sz w:val="20"/>
+      </w:rPr>
+    </w:lvl>
+    <w:lvl w:ilvl="7" w:tentative="1">
+      <w:start w:val="1"/>
+      <w:numFmt w:val="bullet"/>
+      <w:lvlText w:val=""/>
+      <w:lvlJc w:val="left"/>
+      <w:pPr>
+        <w:tabs>
+          <w:tab w:val="num" w:pos="5760"/>
+        </w:tabs>
+        <w:ind w:left="5760" w:hanging="360"/>
+      </w:pPr>
+      <w:rPr>
+        <w:rFonts w:ascii="Wingdings" w:hAnsi="Wingdings" w:hint="default"/>
+        <w:sz w:val="20"/>
+      </w:rPr>
+    </w:lvl>
+    <w:lvl w:ilvl="8" w:tentative="1">
+      <w:start w:val="1"/>
+      <w:numFmt w:val="bullet"/>
+      <w:lvlText w:val=""/>
+      <w:lvlJc w:val="left"/>
+      <w:pPr>
+        <w:tabs>
+          <w:tab w:val="num" w:pos="6480"/>
+        </w:tabs>
+        <w:ind w:left="6480" w:hanging="360"/>
+      </w:pPr>
+      <w:rPr>
+        <w:rFonts w:ascii="Wingdings" w:hAnsi="Wingdings" w:hint="default"/>
+        <w:sz w:val="20"/>
+      </w:rPr>
+    </w:lvl>
+  </w:abstractNum>
+  <w:abstractNum w:abstractNumId="4" w15:restartNumberingAfterBreak="0">
+    <w:nsid w:val="19D70AB3"/>
+    <w:multiLevelType w:val="multilevel"/>
+    <w:tmpl w:val="2F0EB2D2"/>
+    <w:lvl w:ilvl="0">
+      <w:start w:val="1"/>
+      <w:numFmt w:val="bullet"/>
+      <w:lvlText w:val=""/>
+      <w:lvlJc w:val="left"/>
+      <w:pPr>
+        <w:tabs>
+          <w:tab w:val="num" w:pos="720"/>
+        </w:tabs>
+        <w:ind w:left="720" w:hanging="360"/>
+      </w:pPr>
+      <w:rPr>
+        <w:rFonts w:ascii="Symbol" w:hAnsi="Symbol" w:hint="default"/>
+        <w:sz w:val="20"/>
+      </w:rPr>
+    </w:lvl>
+    <w:lvl w:ilvl="1">
+      <w:start w:val="1"/>
+      <w:numFmt w:val="bullet"/>
+      <w:lvlText w:val="o"/>
+      <w:lvlJc w:val="left"/>
+      <w:pPr>
+        <w:tabs>
+          <w:tab w:val="num" w:pos="1440"/>
+        </w:tabs>
+        <w:ind w:left="1440" w:hanging="360"/>
+      </w:pPr>
+      <w:rPr>
+        <w:rFonts w:ascii="Courier New" w:hAnsi="Courier New" w:hint="default"/>
+        <w:sz w:val="20"/>
+      </w:rPr>
+    </w:lvl>
+    <w:lvl w:ilvl="2" w:tentative="1">
+      <w:start w:val="1"/>
+      <w:numFmt w:val="bullet"/>
+      <w:lvlText w:val=""/>
+      <w:lvlJc w:val="left"/>
+      <w:pPr>
+        <w:tabs>
+          <w:tab w:val="num" w:pos="2160"/>
+        </w:tabs>
+        <w:ind w:left="2160" w:hanging="360"/>
+      </w:pPr>
+      <w:rPr>
+        <w:rFonts w:ascii="Wingdings" w:hAnsi="Wingdings" w:hint="default"/>
+        <w:sz w:val="20"/>
+      </w:rPr>
+    </w:lvl>
+    <w:lvl w:ilvl="3" w:tentative="1">
+      <w:start w:val="1"/>
+      <w:numFmt w:val="bullet"/>
+      <w:lvlText w:val=""/>
+      <w:lvlJc w:val="left"/>
+      <w:pPr>
+        <w:tabs>
+          <w:tab w:val="num" w:pos="2880"/>
+        </w:tabs>
+        <w:ind w:left="2880" w:hanging="360"/>
+      </w:pPr>
+      <w:rPr>
+        <w:rFonts w:ascii="Wingdings" w:hAnsi="Wingdings" w:hint="default"/>
+        <w:sz w:val="20"/>
+      </w:rPr>
+    </w:lvl>
+    <w:lvl w:ilvl="4" w:tentative="1">
+      <w:start w:val="1"/>
+      <w:numFmt w:val="bullet"/>
+      <w:lvlText w:val=""/>
+      <w:lvlJc w:val="left"/>
+      <w:pPr>
+        <w:tabs>
+          <w:tab w:val="num" w:pos="3600"/>
+        </w:tabs>
+        <w:ind w:left="3600" w:hanging="360"/>
+      </w:pPr>
+      <w:rPr>
+        <w:rFonts w:ascii="Wingdings" w:hAnsi="Wingdings" w:hint="default"/>
+        <w:sz w:val="20"/>
+      </w:rPr>
+    </w:lvl>
+    <w:lvl w:ilvl="5" w:tentative="1">
+      <w:start w:val="1"/>
+      <w:numFmt w:val="bullet"/>
+      <w:lvlText w:val=""/>
+      <w:lvlJc w:val="left"/>
+      <w:pPr>
+        <w:tabs>
+          <w:tab w:val="num" w:pos="4320"/>
+        </w:tabs>
+        <w:ind w:left="4320" w:hanging="360"/>
+      </w:pPr>
+      <w:rPr>
+        <w:rFonts w:ascii="Wingdings" w:hAnsi="Wingdings" w:hint="default"/>
+        <w:sz w:val="20"/>
+      </w:rPr>
+    </w:lvl>
+    <w:lvl w:ilvl="6" w:tentative="1">
+      <w:start w:val="1"/>
+      <w:numFmt w:val="bullet"/>
+      <w:lvlText w:val=""/>
+      <w:lvlJc w:val="left"/>
+      <w:pPr>
+        <w:tabs>
+          <w:tab w:val="num" w:pos="5040"/>
+        </w:tabs>
+        <w:ind w:left="5040" w:hanging="360"/>
+      </w:pPr>
+      <w:rPr>
+        <w:rFonts w:ascii="Wingdings" w:hAnsi="Wingdings" w:hint="default"/>
+        <w:sz w:val="20"/>
+      </w:rPr>
+    </w:lvl>
+    <w:lvl w:ilvl="7" w:tentative="1">
+      <w:start w:val="1"/>
+      <w:numFmt w:val="bullet"/>
+      <w:lvlText w:val=""/>
+      <w:lvlJc w:val="left"/>
+      <w:pPr>
+        <w:tabs>
+          <w:tab w:val="num" w:pos="5760"/>
+        </w:tabs>
+        <w:ind w:left="5760" w:hanging="360"/>
+      </w:pPr>
+      <w:rPr>
+        <w:rFonts w:ascii="Wingdings" w:hAnsi="Wingdings" w:hint="default"/>
+        <w:sz w:val="20"/>
+      </w:rPr>
+    </w:lvl>
+    <w:lvl w:ilvl="8" w:tentative="1">
+      <w:start w:val="1"/>
+      <w:numFmt w:val="bullet"/>
+      <w:lvlText w:val=""/>
+      <w:lvlJc w:val="left"/>
+      <w:pPr>
+        <w:tabs>
+          <w:tab w:val="num" w:pos="6480"/>
+        </w:tabs>
+        <w:ind w:left="6480" w:hanging="360"/>
+      </w:pPr>
+      <w:rPr>
+        <w:rFonts w:ascii="Wingdings" w:hAnsi="Wingdings" w:hint="default"/>
+        <w:sz w:val="20"/>
+      </w:rPr>
+    </w:lvl>
+  </w:abstractNum>
+  <w:abstractNum w:abstractNumId="5" w15:restartNumberingAfterBreak="0">
     <w:nsid w:val="1E3B05F5"/>
     <w:multiLevelType w:val="multilevel"/>
     <w:tmpl w:val="69CAD054"/>
@@ -2235,7 +3227,7 @@
       </w:rPr>
     </w:lvl>
   </w:abstractNum>
-  <w:abstractNum w:abstractNumId="2" w15:restartNumberingAfterBreak="0">
+  <w:abstractNum w:abstractNumId="6" w15:restartNumberingAfterBreak="0">
     <w:nsid w:val="26E02332"/>
     <w:multiLevelType w:val="multilevel"/>
     <w:tmpl w:val="C0EA4D9A"/>
@@ -2384,7 +3376,305 @@
       </w:rPr>
     </w:lvl>
   </w:abstractNum>
-  <w:abstractNum w:abstractNumId="3" w15:restartNumberingAfterBreak="0">
+  <w:abstractNum w:abstractNumId="7" w15:restartNumberingAfterBreak="0">
+    <w:nsid w:val="308D5F5B"/>
+    <w:multiLevelType w:val="multilevel"/>
+    <w:tmpl w:val="C5945548"/>
+    <w:lvl w:ilvl="0">
+      <w:start w:val="1"/>
+      <w:numFmt w:val="bullet"/>
+      <w:lvlText w:val=""/>
+      <w:lvlJc w:val="left"/>
+      <w:pPr>
+        <w:tabs>
+          <w:tab w:val="num" w:pos="720"/>
+        </w:tabs>
+        <w:ind w:left="720" w:hanging="360"/>
+      </w:pPr>
+      <w:rPr>
+        <w:rFonts w:ascii="Symbol" w:hAnsi="Symbol" w:hint="default"/>
+        <w:sz w:val="20"/>
+      </w:rPr>
+    </w:lvl>
+    <w:lvl w:ilvl="1" w:tentative="1">
+      <w:start w:val="1"/>
+      <w:numFmt w:val="bullet"/>
+      <w:lvlText w:val="o"/>
+      <w:lvlJc w:val="left"/>
+      <w:pPr>
+        <w:tabs>
+          <w:tab w:val="num" w:pos="1440"/>
+        </w:tabs>
+        <w:ind w:left="1440" w:hanging="360"/>
+      </w:pPr>
+      <w:rPr>
+        <w:rFonts w:ascii="Courier New" w:hAnsi="Courier New" w:hint="default"/>
+        <w:sz w:val="20"/>
+      </w:rPr>
+    </w:lvl>
+    <w:lvl w:ilvl="2" w:tentative="1">
+      <w:start w:val="1"/>
+      <w:numFmt w:val="bullet"/>
+      <w:lvlText w:val=""/>
+      <w:lvlJc w:val="left"/>
+      <w:pPr>
+        <w:tabs>
+          <w:tab w:val="num" w:pos="2160"/>
+        </w:tabs>
+        <w:ind w:left="2160" w:hanging="360"/>
+      </w:pPr>
+      <w:rPr>
+        <w:rFonts w:ascii="Wingdings" w:hAnsi="Wingdings" w:hint="default"/>
+        <w:sz w:val="20"/>
+      </w:rPr>
+    </w:lvl>
+    <w:lvl w:ilvl="3" w:tentative="1">
+      <w:start w:val="1"/>
+      <w:numFmt w:val="bullet"/>
+      <w:lvlText w:val=""/>
+      <w:lvlJc w:val="left"/>
+      <w:pPr>
+        <w:tabs>
+          <w:tab w:val="num" w:pos="2880"/>
+        </w:tabs>
+        <w:ind w:left="2880" w:hanging="360"/>
+      </w:pPr>
+      <w:rPr>
+        <w:rFonts w:ascii="Wingdings" w:hAnsi="Wingdings" w:hint="default"/>
+        <w:sz w:val="20"/>
+      </w:rPr>
+    </w:lvl>
+    <w:lvl w:ilvl="4" w:tentative="1">
+      <w:start w:val="1"/>
+      <w:numFmt w:val="bullet"/>
+      <w:lvlText w:val=""/>
+      <w:lvlJc w:val="left"/>
+      <w:pPr>
+        <w:tabs>
+          <w:tab w:val="num" w:pos="3600"/>
+        </w:tabs>
+        <w:ind w:left="3600" w:hanging="360"/>
+      </w:pPr>
+      <w:rPr>
+        <w:rFonts w:ascii="Wingdings" w:hAnsi="Wingdings" w:hint="default"/>
+        <w:sz w:val="20"/>
+      </w:rPr>
+    </w:lvl>
+    <w:lvl w:ilvl="5" w:tentative="1">
+      <w:start w:val="1"/>
+      <w:numFmt w:val="bullet"/>
+      <w:lvlText w:val=""/>
+      <w:lvlJc w:val="left"/>
+      <w:pPr>
+        <w:tabs>
+          <w:tab w:val="num" w:pos="4320"/>
+        </w:tabs>
+        <w:ind w:left="4320" w:hanging="360"/>
+      </w:pPr>
+      <w:rPr>
+        <w:rFonts w:ascii="Wingdings" w:hAnsi="Wingdings" w:hint="default"/>
+        <w:sz w:val="20"/>
+      </w:rPr>
+    </w:lvl>
+    <w:lvl w:ilvl="6" w:tentative="1">
+      <w:start w:val="1"/>
+      <w:numFmt w:val="bullet"/>
+      <w:lvlText w:val=""/>
+      <w:lvlJc w:val="left"/>
+      <w:pPr>
+        <w:tabs>
+          <w:tab w:val="num" w:pos="5040"/>
+        </w:tabs>
+        <w:ind w:left="5040" w:hanging="360"/>
+      </w:pPr>
+      <w:rPr>
+        <w:rFonts w:ascii="Wingdings" w:hAnsi="Wingdings" w:hint="default"/>
+        <w:sz w:val="20"/>
+      </w:rPr>
+    </w:lvl>
+    <w:lvl w:ilvl="7" w:tentative="1">
+      <w:start w:val="1"/>
+      <w:numFmt w:val="bullet"/>
+      <w:lvlText w:val=""/>
+      <w:lvlJc w:val="left"/>
+      <w:pPr>
+        <w:tabs>
+          <w:tab w:val="num" w:pos="5760"/>
+        </w:tabs>
+        <w:ind w:left="5760" w:hanging="360"/>
+      </w:pPr>
+      <w:rPr>
+        <w:rFonts w:ascii="Wingdings" w:hAnsi="Wingdings" w:hint="default"/>
+        <w:sz w:val="20"/>
+      </w:rPr>
+    </w:lvl>
+    <w:lvl w:ilvl="8" w:tentative="1">
+      <w:start w:val="1"/>
+      <w:numFmt w:val="bullet"/>
+      <w:lvlText w:val=""/>
+      <w:lvlJc w:val="left"/>
+      <w:pPr>
+        <w:tabs>
+          <w:tab w:val="num" w:pos="6480"/>
+        </w:tabs>
+        <w:ind w:left="6480" w:hanging="360"/>
+      </w:pPr>
+      <w:rPr>
+        <w:rFonts w:ascii="Wingdings" w:hAnsi="Wingdings" w:hint="default"/>
+        <w:sz w:val="20"/>
+      </w:rPr>
+    </w:lvl>
+  </w:abstractNum>
+  <w:abstractNum w:abstractNumId="8" w15:restartNumberingAfterBreak="0">
+    <w:nsid w:val="309626F3"/>
+    <w:multiLevelType w:val="multilevel"/>
+    <w:tmpl w:val="D034EE4A"/>
+    <w:lvl w:ilvl="0">
+      <w:start w:val="1"/>
+      <w:numFmt w:val="bullet"/>
+      <w:lvlText w:val=""/>
+      <w:lvlJc w:val="left"/>
+      <w:pPr>
+        <w:tabs>
+          <w:tab w:val="num" w:pos="720"/>
+        </w:tabs>
+        <w:ind w:left="720" w:hanging="360"/>
+      </w:pPr>
+      <w:rPr>
+        <w:rFonts w:ascii="Symbol" w:hAnsi="Symbol" w:hint="default"/>
+        <w:sz w:val="20"/>
+      </w:rPr>
+    </w:lvl>
+    <w:lvl w:ilvl="1" w:tentative="1">
+      <w:start w:val="1"/>
+      <w:numFmt w:val="bullet"/>
+      <w:lvlText w:val="o"/>
+      <w:lvlJc w:val="left"/>
+      <w:pPr>
+        <w:tabs>
+          <w:tab w:val="num" w:pos="1440"/>
+        </w:tabs>
+        <w:ind w:left="1440" w:hanging="360"/>
+      </w:pPr>
+      <w:rPr>
+        <w:rFonts w:ascii="Courier New" w:hAnsi="Courier New" w:hint="default"/>
+        <w:sz w:val="20"/>
+      </w:rPr>
+    </w:lvl>
+    <w:lvl w:ilvl="2" w:tentative="1">
+      <w:start w:val="1"/>
+      <w:numFmt w:val="bullet"/>
+      <w:lvlText w:val=""/>
+      <w:lvlJc w:val="left"/>
+      <w:pPr>
+        <w:tabs>
+          <w:tab w:val="num" w:pos="2160"/>
+        </w:tabs>
+        <w:ind w:left="2160" w:hanging="360"/>
+      </w:pPr>
+      <w:rPr>
+        <w:rFonts w:ascii="Wingdings" w:hAnsi="Wingdings" w:hint="default"/>
+        <w:sz w:val="20"/>
+      </w:rPr>
+    </w:lvl>
+    <w:lvl w:ilvl="3" w:tentative="1">
+      <w:start w:val="1"/>
+      <w:numFmt w:val="bullet"/>
+      <w:lvlText w:val=""/>
+      <w:lvlJc w:val="left"/>
+      <w:pPr>
+        <w:tabs>
+          <w:tab w:val="num" w:pos="2880"/>
+        </w:tabs>
+        <w:ind w:left="2880" w:hanging="360"/>
+      </w:pPr>
+      <w:rPr>
+        <w:rFonts w:ascii="Wingdings" w:hAnsi="Wingdings" w:hint="default"/>
+        <w:sz w:val="20"/>
+      </w:rPr>
+    </w:lvl>
+    <w:lvl w:ilvl="4" w:tentative="1">
+      <w:start w:val="1"/>
+      <w:numFmt w:val="bullet"/>
+      <w:lvlText w:val=""/>
+      <w:lvlJc w:val="left"/>
+      <w:pPr>
+        <w:tabs>
+          <w:tab w:val="num" w:pos="3600"/>
+        </w:tabs>
+        <w:ind w:left="3600" w:hanging="360"/>
+      </w:pPr>
+      <w:rPr>
+        <w:rFonts w:ascii="Wingdings" w:hAnsi="Wingdings" w:hint="default"/>
+        <w:sz w:val="20"/>
+      </w:rPr>
+    </w:lvl>
+    <w:lvl w:ilvl="5" w:tentative="1">
+      <w:start w:val="1"/>
+      <w:numFmt w:val="bullet"/>
+      <w:lvlText w:val=""/>
+      <w:lvlJc w:val="left"/>
+      <w:pPr>
+        <w:tabs>
+          <w:tab w:val="num" w:pos="4320"/>
+        </w:tabs>
+        <w:ind w:left="4320" w:hanging="360"/>
+      </w:pPr>
+      <w:rPr>
+        <w:rFonts w:ascii="Wingdings" w:hAnsi="Wingdings" w:hint="default"/>
+        <w:sz w:val="20"/>
+      </w:rPr>
+    </w:lvl>
+    <w:lvl w:ilvl="6" w:tentative="1">
+      <w:start w:val="1"/>
+      <w:numFmt w:val="bullet"/>
+      <w:lvlText w:val=""/>
+      <w:lvlJc w:val="left"/>
+      <w:pPr>
+        <w:tabs>
+          <w:tab w:val="num" w:pos="5040"/>
+        </w:tabs>
+        <w:ind w:left="5040" w:hanging="360"/>
+      </w:pPr>
+      <w:rPr>
+        <w:rFonts w:ascii="Wingdings" w:hAnsi="Wingdings" w:hint="default"/>
+        <w:sz w:val="20"/>
+      </w:rPr>
+    </w:lvl>
+    <w:lvl w:ilvl="7" w:tentative="1">
+      <w:start w:val="1"/>
+      <w:numFmt w:val="bullet"/>
+      <w:lvlText w:val=""/>
+      <w:lvlJc w:val="left"/>
+      <w:pPr>
+        <w:tabs>
+          <w:tab w:val="num" w:pos="5760"/>
+        </w:tabs>
+        <w:ind w:left="5760" w:hanging="360"/>
+      </w:pPr>
+      <w:rPr>
+        <w:rFonts w:ascii="Wingdings" w:hAnsi="Wingdings" w:hint="default"/>
+        <w:sz w:val="20"/>
+      </w:rPr>
+    </w:lvl>
+    <w:lvl w:ilvl="8" w:tentative="1">
+      <w:start w:val="1"/>
+      <w:numFmt w:val="bullet"/>
+      <w:lvlText w:val=""/>
+      <w:lvlJc w:val="left"/>
+      <w:pPr>
+        <w:tabs>
+          <w:tab w:val="num" w:pos="6480"/>
+        </w:tabs>
+        <w:ind w:left="6480" w:hanging="360"/>
+      </w:pPr>
+      <w:rPr>
+        <w:rFonts w:ascii="Wingdings" w:hAnsi="Wingdings" w:hint="default"/>
+        <w:sz w:val="20"/>
+      </w:rPr>
+    </w:lvl>
+  </w:abstractNum>
+  <w:abstractNum w:abstractNumId="9" w15:restartNumberingAfterBreak="0">
     <w:nsid w:val="30C1172E"/>
     <w:multiLevelType w:val="multilevel"/>
     <w:tmpl w:val="F5B852F6"/>
@@ -2533,7 +3823,242 @@
       </w:rPr>
     </w:lvl>
   </w:abstractNum>
-  <w:abstractNum w:abstractNumId="4" w15:restartNumberingAfterBreak="0">
+  <w:abstractNum w:abstractNumId="10" w15:restartNumberingAfterBreak="0">
+    <w:nsid w:val="322E52B7"/>
+    <w:multiLevelType w:val="multilevel"/>
+    <w:tmpl w:val="F838414E"/>
+    <w:lvl w:ilvl="0">
+      <w:start w:val="4"/>
+      <w:numFmt w:val="decimal"/>
+      <w:lvlText w:val="%1"/>
+      <w:lvlJc w:val="left"/>
+      <w:pPr>
+        <w:ind w:left="360" w:hanging="360"/>
+      </w:pPr>
+      <w:rPr>
+        <w:rFonts w:hint="default"/>
+      </w:rPr>
+    </w:lvl>
+    <w:lvl w:ilvl="1">
+      <w:start w:val="7"/>
+      <w:numFmt w:val="decimal"/>
+      <w:lvlText w:val="%1.%2"/>
+      <w:lvlJc w:val="left"/>
+      <w:pPr>
+        <w:ind w:left="720" w:hanging="360"/>
+      </w:pPr>
+      <w:rPr>
+        <w:rFonts w:hint="default"/>
+      </w:rPr>
+    </w:lvl>
+    <w:lvl w:ilvl="2">
+      <w:start w:val="1"/>
+      <w:numFmt w:val="decimal"/>
+      <w:lvlText w:val="%1.%2.%3"/>
+      <w:lvlJc w:val="left"/>
+      <w:pPr>
+        <w:ind w:left="1440" w:hanging="720"/>
+      </w:pPr>
+      <w:rPr>
+        <w:rFonts w:hint="default"/>
+      </w:rPr>
+    </w:lvl>
+    <w:lvl w:ilvl="3">
+      <w:start w:val="1"/>
+      <w:numFmt w:val="decimal"/>
+      <w:lvlText w:val="%1.%2.%3.%4"/>
+      <w:lvlJc w:val="left"/>
+      <w:pPr>
+        <w:ind w:left="2160" w:hanging="1080"/>
+      </w:pPr>
+      <w:rPr>
+        <w:rFonts w:hint="default"/>
+      </w:rPr>
+    </w:lvl>
+    <w:lvl w:ilvl="4">
+      <w:start w:val="1"/>
+      <w:numFmt w:val="decimal"/>
+      <w:lvlText w:val="%1.%2.%3.%4.%5"/>
+      <w:lvlJc w:val="left"/>
+      <w:pPr>
+        <w:ind w:left="2520" w:hanging="1080"/>
+      </w:pPr>
+      <w:rPr>
+        <w:rFonts w:hint="default"/>
+      </w:rPr>
+    </w:lvl>
+    <w:lvl w:ilvl="5">
+      <w:start w:val="1"/>
+      <w:numFmt w:val="decimal"/>
+      <w:lvlText w:val="%1.%2.%3.%4.%5.%6"/>
+      <w:lvlJc w:val="left"/>
+      <w:pPr>
+        <w:ind w:left="3240" w:hanging="1440"/>
+      </w:pPr>
+      <w:rPr>
+        <w:rFonts w:hint="default"/>
+      </w:rPr>
+    </w:lvl>
+    <w:lvl w:ilvl="6">
+      <w:start w:val="1"/>
+      <w:numFmt w:val="decimal"/>
+      <w:lvlText w:val="%1.%2.%3.%4.%5.%6.%7"/>
+      <w:lvlJc w:val="left"/>
+      <w:pPr>
+        <w:ind w:left="3600" w:hanging="1440"/>
+      </w:pPr>
+      <w:rPr>
+        <w:rFonts w:hint="default"/>
+      </w:rPr>
+    </w:lvl>
+    <w:lvl w:ilvl="7">
+      <w:start w:val="1"/>
+      <w:numFmt w:val="decimal"/>
+      <w:lvlText w:val="%1.%2.%3.%4.%5.%6.%7.%8"/>
+      <w:lvlJc w:val="left"/>
+      <w:pPr>
+        <w:ind w:left="4320" w:hanging="1800"/>
+      </w:pPr>
+      <w:rPr>
+        <w:rFonts w:hint="default"/>
+      </w:rPr>
+    </w:lvl>
+    <w:lvl w:ilvl="8">
+      <w:start w:val="1"/>
+      <w:numFmt w:val="decimal"/>
+      <w:lvlText w:val="%1.%2.%3.%4.%5.%6.%7.%8.%9"/>
+      <w:lvlJc w:val="left"/>
+      <w:pPr>
+        <w:ind w:left="4680" w:hanging="1800"/>
+      </w:pPr>
+      <w:rPr>
+        <w:rFonts w:hint="default"/>
+      </w:rPr>
+    </w:lvl>
+  </w:abstractNum>
+  <w:abstractNum w:abstractNumId="11" w15:restartNumberingAfterBreak="0">
+    <w:nsid w:val="382A5D1D"/>
+    <w:multiLevelType w:val="multilevel"/>
+    <w:tmpl w:val="E9BEDADC"/>
+    <w:lvl w:ilvl="0">
+      <w:start w:val="4"/>
+      <w:numFmt w:val="decimal"/>
+      <w:lvlText w:val="%1"/>
+      <w:lvlJc w:val="left"/>
+      <w:pPr>
+        <w:ind w:left="360" w:hanging="360"/>
+      </w:pPr>
+      <w:rPr>
+        <w:rFonts w:hint="default"/>
+        <w:b/>
+      </w:rPr>
+    </w:lvl>
+    <w:lvl w:ilvl="1">
+      <w:start w:val="6"/>
+      <w:numFmt w:val="decimal"/>
+      <w:lvlText w:val="%1.%2"/>
+      <w:lvlJc w:val="left"/>
+      <w:pPr>
+        <w:ind w:left="360" w:hanging="360"/>
+      </w:pPr>
+      <w:rPr>
+        <w:rFonts w:hint="default"/>
+        <w:b/>
+      </w:rPr>
+    </w:lvl>
+    <w:lvl w:ilvl="2">
+      <w:start w:val="1"/>
+      <w:numFmt w:val="decimal"/>
+      <w:lvlText w:val="%1.%2.%3"/>
+      <w:lvlJc w:val="left"/>
+      <w:pPr>
+        <w:ind w:left="720" w:hanging="720"/>
+      </w:pPr>
+      <w:rPr>
+        <w:rFonts w:hint="default"/>
+        <w:b/>
+      </w:rPr>
+    </w:lvl>
+    <w:lvl w:ilvl="3">
+      <w:start w:val="1"/>
+      <w:numFmt w:val="decimal"/>
+      <w:lvlText w:val="%1.%2.%3.%4"/>
+      <w:lvlJc w:val="left"/>
+      <w:pPr>
+        <w:ind w:left="1080" w:hanging="1080"/>
+      </w:pPr>
+      <w:rPr>
+        <w:rFonts w:hint="default"/>
+        <w:b/>
+      </w:rPr>
+    </w:lvl>
+    <w:lvl w:ilvl="4">
+      <w:start w:val="1"/>
+      <w:numFmt w:val="decimal"/>
+      <w:lvlText w:val="%1.%2.%3.%4.%5"/>
+      <w:lvlJc w:val="left"/>
+      <w:pPr>
+        <w:ind w:left="1080" w:hanging="1080"/>
+      </w:pPr>
+      <w:rPr>
+        <w:rFonts w:hint="default"/>
+        <w:b/>
+      </w:rPr>
+    </w:lvl>
+    <w:lvl w:ilvl="5">
+      <w:start w:val="1"/>
+      <w:numFmt w:val="decimal"/>
+      <w:lvlText w:val="%1.%2.%3.%4.%5.%6"/>
+      <w:lvlJc w:val="left"/>
+      <w:pPr>
+        <w:ind w:left="1440" w:hanging="1440"/>
+      </w:pPr>
+      <w:rPr>
+        <w:rFonts w:hint="default"/>
+        <w:b/>
+      </w:rPr>
+    </w:lvl>
+    <w:lvl w:ilvl="6">
+      <w:start w:val="1"/>
+      <w:numFmt w:val="decimal"/>
+      <w:lvlText w:val="%1.%2.%3.%4.%5.%6.%7"/>
+      <w:lvlJc w:val="left"/>
+      <w:pPr>
+        <w:ind w:left="1440" w:hanging="1440"/>
+      </w:pPr>
+      <w:rPr>
+        <w:rFonts w:hint="default"/>
+        <w:b/>
+      </w:rPr>
+    </w:lvl>
+    <w:lvl w:ilvl="7">
+      <w:start w:val="1"/>
+      <w:numFmt w:val="decimal"/>
+      <w:lvlText w:val="%1.%2.%3.%4.%5.%6.%7.%8"/>
+      <w:lvlJc w:val="left"/>
+      <w:pPr>
+        <w:ind w:left="1800" w:hanging="1800"/>
+      </w:pPr>
+      <w:rPr>
+        <w:rFonts w:hint="default"/>
+        <w:b/>
+      </w:rPr>
+    </w:lvl>
+    <w:lvl w:ilvl="8">
+      <w:start w:val="1"/>
+      <w:numFmt w:val="decimal"/>
+      <w:lvlText w:val="%1.%2.%3.%4.%5.%6.%7.%8.%9"/>
+      <w:lvlJc w:val="left"/>
+      <w:pPr>
+        <w:ind w:left="1800" w:hanging="1800"/>
+      </w:pPr>
+      <w:rPr>
+        <w:rFonts w:hint="default"/>
+        <w:b/>
+      </w:rPr>
+    </w:lvl>
+  </w:abstractNum>
+  <w:abstractNum w:abstractNumId="12" w15:restartNumberingAfterBreak="0">
     <w:nsid w:val="382E7FDD"/>
     <w:multiLevelType w:val="multilevel"/>
     <w:tmpl w:val="10665E3A"/>
@@ -2682,7 +4207,305 @@
       </w:rPr>
     </w:lvl>
   </w:abstractNum>
-  <w:abstractNum w:abstractNumId="5" w15:restartNumberingAfterBreak="0">
+  <w:abstractNum w:abstractNumId="13" w15:restartNumberingAfterBreak="0">
+    <w:nsid w:val="3DB466B9"/>
+    <w:multiLevelType w:val="multilevel"/>
+    <w:tmpl w:val="1CF40A22"/>
+    <w:lvl w:ilvl="0">
+      <w:start w:val="1"/>
+      <w:numFmt w:val="bullet"/>
+      <w:lvlText w:val=""/>
+      <w:lvlJc w:val="left"/>
+      <w:pPr>
+        <w:tabs>
+          <w:tab w:val="num" w:pos="720"/>
+        </w:tabs>
+        <w:ind w:left="720" w:hanging="360"/>
+      </w:pPr>
+      <w:rPr>
+        <w:rFonts w:ascii="Symbol" w:hAnsi="Symbol" w:hint="default"/>
+        <w:sz w:val="20"/>
+      </w:rPr>
+    </w:lvl>
+    <w:lvl w:ilvl="1">
+      <w:start w:val="1"/>
+      <w:numFmt w:val="bullet"/>
+      <w:lvlText w:val="o"/>
+      <w:lvlJc w:val="left"/>
+      <w:pPr>
+        <w:tabs>
+          <w:tab w:val="num" w:pos="1440"/>
+        </w:tabs>
+        <w:ind w:left="1440" w:hanging="360"/>
+      </w:pPr>
+      <w:rPr>
+        <w:rFonts w:ascii="Courier New" w:hAnsi="Courier New" w:hint="default"/>
+        <w:sz w:val="20"/>
+      </w:rPr>
+    </w:lvl>
+    <w:lvl w:ilvl="2" w:tentative="1">
+      <w:start w:val="1"/>
+      <w:numFmt w:val="bullet"/>
+      <w:lvlText w:val=""/>
+      <w:lvlJc w:val="left"/>
+      <w:pPr>
+        <w:tabs>
+          <w:tab w:val="num" w:pos="2160"/>
+        </w:tabs>
+        <w:ind w:left="2160" w:hanging="360"/>
+      </w:pPr>
+      <w:rPr>
+        <w:rFonts w:ascii="Wingdings" w:hAnsi="Wingdings" w:hint="default"/>
+        <w:sz w:val="20"/>
+      </w:rPr>
+    </w:lvl>
+    <w:lvl w:ilvl="3" w:tentative="1">
+      <w:start w:val="1"/>
+      <w:numFmt w:val="bullet"/>
+      <w:lvlText w:val=""/>
+      <w:lvlJc w:val="left"/>
+      <w:pPr>
+        <w:tabs>
+          <w:tab w:val="num" w:pos="2880"/>
+        </w:tabs>
+        <w:ind w:left="2880" w:hanging="360"/>
+      </w:pPr>
+      <w:rPr>
+        <w:rFonts w:ascii="Wingdings" w:hAnsi="Wingdings" w:hint="default"/>
+        <w:sz w:val="20"/>
+      </w:rPr>
+    </w:lvl>
+    <w:lvl w:ilvl="4" w:tentative="1">
+      <w:start w:val="1"/>
+      <w:numFmt w:val="bullet"/>
+      <w:lvlText w:val=""/>
+      <w:lvlJc w:val="left"/>
+      <w:pPr>
+        <w:tabs>
+          <w:tab w:val="num" w:pos="3600"/>
+        </w:tabs>
+        <w:ind w:left="3600" w:hanging="360"/>
+      </w:pPr>
+      <w:rPr>
+        <w:rFonts w:ascii="Wingdings" w:hAnsi="Wingdings" w:hint="default"/>
+        <w:sz w:val="20"/>
+      </w:rPr>
+    </w:lvl>
+    <w:lvl w:ilvl="5" w:tentative="1">
+      <w:start w:val="1"/>
+      <w:numFmt w:val="bullet"/>
+      <w:lvlText w:val=""/>
+      <w:lvlJc w:val="left"/>
+      <w:pPr>
+        <w:tabs>
+          <w:tab w:val="num" w:pos="4320"/>
+        </w:tabs>
+        <w:ind w:left="4320" w:hanging="360"/>
+      </w:pPr>
+      <w:rPr>
+        <w:rFonts w:ascii="Wingdings" w:hAnsi="Wingdings" w:hint="default"/>
+        <w:sz w:val="20"/>
+      </w:rPr>
+    </w:lvl>
+    <w:lvl w:ilvl="6" w:tentative="1">
+      <w:start w:val="1"/>
+      <w:numFmt w:val="bullet"/>
+      <w:lvlText w:val=""/>
+      <w:lvlJc w:val="left"/>
+      <w:pPr>
+        <w:tabs>
+          <w:tab w:val="num" w:pos="5040"/>
+        </w:tabs>
+        <w:ind w:left="5040" w:hanging="360"/>
+      </w:pPr>
+      <w:rPr>
+        <w:rFonts w:ascii="Wingdings" w:hAnsi="Wingdings" w:hint="default"/>
+        <w:sz w:val="20"/>
+      </w:rPr>
+    </w:lvl>
+    <w:lvl w:ilvl="7" w:tentative="1">
+      <w:start w:val="1"/>
+      <w:numFmt w:val="bullet"/>
+      <w:lvlText w:val=""/>
+      <w:lvlJc w:val="left"/>
+      <w:pPr>
+        <w:tabs>
+          <w:tab w:val="num" w:pos="5760"/>
+        </w:tabs>
+        <w:ind w:left="5760" w:hanging="360"/>
+      </w:pPr>
+      <w:rPr>
+        <w:rFonts w:ascii="Wingdings" w:hAnsi="Wingdings" w:hint="default"/>
+        <w:sz w:val="20"/>
+      </w:rPr>
+    </w:lvl>
+    <w:lvl w:ilvl="8" w:tentative="1">
+      <w:start w:val="1"/>
+      <w:numFmt w:val="bullet"/>
+      <w:lvlText w:val=""/>
+      <w:lvlJc w:val="left"/>
+      <w:pPr>
+        <w:tabs>
+          <w:tab w:val="num" w:pos="6480"/>
+        </w:tabs>
+        <w:ind w:left="6480" w:hanging="360"/>
+      </w:pPr>
+      <w:rPr>
+        <w:rFonts w:ascii="Wingdings" w:hAnsi="Wingdings" w:hint="default"/>
+        <w:sz w:val="20"/>
+      </w:rPr>
+    </w:lvl>
+  </w:abstractNum>
+  <w:abstractNum w:abstractNumId="14" w15:restartNumberingAfterBreak="0">
+    <w:nsid w:val="427306F7"/>
+    <w:multiLevelType w:val="multilevel"/>
+    <w:tmpl w:val="E8408A3C"/>
+    <w:lvl w:ilvl="0">
+      <w:start w:val="1"/>
+      <w:numFmt w:val="bullet"/>
+      <w:lvlText w:val=""/>
+      <w:lvlJc w:val="left"/>
+      <w:pPr>
+        <w:tabs>
+          <w:tab w:val="num" w:pos="720"/>
+        </w:tabs>
+        <w:ind w:left="720" w:hanging="360"/>
+      </w:pPr>
+      <w:rPr>
+        <w:rFonts w:ascii="Symbol" w:hAnsi="Symbol" w:hint="default"/>
+        <w:sz w:val="20"/>
+      </w:rPr>
+    </w:lvl>
+    <w:lvl w:ilvl="1" w:tentative="1">
+      <w:start w:val="1"/>
+      <w:numFmt w:val="bullet"/>
+      <w:lvlText w:val="o"/>
+      <w:lvlJc w:val="left"/>
+      <w:pPr>
+        <w:tabs>
+          <w:tab w:val="num" w:pos="1440"/>
+        </w:tabs>
+        <w:ind w:left="1440" w:hanging="360"/>
+      </w:pPr>
+      <w:rPr>
+        <w:rFonts w:ascii="Courier New" w:hAnsi="Courier New" w:hint="default"/>
+        <w:sz w:val="20"/>
+      </w:rPr>
+    </w:lvl>
+    <w:lvl w:ilvl="2" w:tentative="1">
+      <w:start w:val="1"/>
+      <w:numFmt w:val="bullet"/>
+      <w:lvlText w:val=""/>
+      <w:lvlJc w:val="left"/>
+      <w:pPr>
+        <w:tabs>
+          <w:tab w:val="num" w:pos="2160"/>
+        </w:tabs>
+        <w:ind w:left="2160" w:hanging="360"/>
+      </w:pPr>
+      <w:rPr>
+        <w:rFonts w:ascii="Wingdings" w:hAnsi="Wingdings" w:hint="default"/>
+        <w:sz w:val="20"/>
+      </w:rPr>
+    </w:lvl>
+    <w:lvl w:ilvl="3" w:tentative="1">
+      <w:start w:val="1"/>
+      <w:numFmt w:val="bullet"/>
+      <w:lvlText w:val=""/>
+      <w:lvlJc w:val="left"/>
+      <w:pPr>
+        <w:tabs>
+          <w:tab w:val="num" w:pos="2880"/>
+        </w:tabs>
+        <w:ind w:left="2880" w:hanging="360"/>
+      </w:pPr>
+      <w:rPr>
+        <w:rFonts w:ascii="Wingdings" w:hAnsi="Wingdings" w:hint="default"/>
+        <w:sz w:val="20"/>
+      </w:rPr>
+    </w:lvl>
+    <w:lvl w:ilvl="4" w:tentative="1">
+      <w:start w:val="1"/>
+      <w:numFmt w:val="bullet"/>
+      <w:lvlText w:val=""/>
+      <w:lvlJc w:val="left"/>
+      <w:pPr>
+        <w:tabs>
+          <w:tab w:val="num" w:pos="3600"/>
+        </w:tabs>
+        <w:ind w:left="3600" w:hanging="360"/>
+      </w:pPr>
+      <w:rPr>
+        <w:rFonts w:ascii="Wingdings" w:hAnsi="Wingdings" w:hint="default"/>
+        <w:sz w:val="20"/>
+      </w:rPr>
+    </w:lvl>
+    <w:lvl w:ilvl="5" w:tentative="1">
+      <w:start w:val="1"/>
+      <w:numFmt w:val="bullet"/>
+      <w:lvlText w:val=""/>
+      <w:lvlJc w:val="left"/>
+      <w:pPr>
+        <w:tabs>
+          <w:tab w:val="num" w:pos="4320"/>
+        </w:tabs>
+        <w:ind w:left="4320" w:hanging="360"/>
+      </w:pPr>
+      <w:rPr>
+        <w:rFonts w:ascii="Wingdings" w:hAnsi="Wingdings" w:hint="default"/>
+        <w:sz w:val="20"/>
+      </w:rPr>
+    </w:lvl>
+    <w:lvl w:ilvl="6" w:tentative="1">
+      <w:start w:val="1"/>
+      <w:numFmt w:val="bullet"/>
+      <w:lvlText w:val=""/>
+      <w:lvlJc w:val="left"/>
+      <w:pPr>
+        <w:tabs>
+          <w:tab w:val="num" w:pos="5040"/>
+        </w:tabs>
+        <w:ind w:left="5040" w:hanging="360"/>
+      </w:pPr>
+      <w:rPr>
+        <w:rFonts w:ascii="Wingdings" w:hAnsi="Wingdings" w:hint="default"/>
+        <w:sz w:val="20"/>
+      </w:rPr>
+    </w:lvl>
+    <w:lvl w:ilvl="7" w:tentative="1">
+      <w:start w:val="1"/>
+      <w:numFmt w:val="bullet"/>
+      <w:lvlText w:val=""/>
+      <w:lvlJc w:val="left"/>
+      <w:pPr>
+        <w:tabs>
+          <w:tab w:val="num" w:pos="5760"/>
+        </w:tabs>
+        <w:ind w:left="5760" w:hanging="360"/>
+      </w:pPr>
+      <w:rPr>
+        <w:rFonts w:ascii="Wingdings" w:hAnsi="Wingdings" w:hint="default"/>
+        <w:sz w:val="20"/>
+      </w:rPr>
+    </w:lvl>
+    <w:lvl w:ilvl="8" w:tentative="1">
+      <w:start w:val="1"/>
+      <w:numFmt w:val="bullet"/>
+      <w:lvlText w:val=""/>
+      <w:lvlJc w:val="left"/>
+      <w:pPr>
+        <w:tabs>
+          <w:tab w:val="num" w:pos="6480"/>
+        </w:tabs>
+        <w:ind w:left="6480" w:hanging="360"/>
+      </w:pPr>
+      <w:rPr>
+        <w:rFonts w:ascii="Wingdings" w:hAnsi="Wingdings" w:hint="default"/>
+        <w:sz w:val="20"/>
+      </w:rPr>
+    </w:lvl>
+  </w:abstractNum>
+  <w:abstractNum w:abstractNumId="15" w15:restartNumberingAfterBreak="0">
     <w:nsid w:val="45231114"/>
     <w:multiLevelType w:val="multilevel"/>
     <w:tmpl w:val="E0FCABFA"/>
@@ -2831,7 +4654,7 @@
       </w:rPr>
     </w:lvl>
   </w:abstractNum>
-  <w:abstractNum w:abstractNumId="6" w15:restartNumberingAfterBreak="0">
+  <w:abstractNum w:abstractNumId="16" w15:restartNumberingAfterBreak="0">
     <w:nsid w:val="5A8735ED"/>
     <w:multiLevelType w:val="multilevel"/>
     <w:tmpl w:val="F182A058"/>
@@ -2980,7 +4803,7 @@
       </w:rPr>
     </w:lvl>
   </w:abstractNum>
-  <w:abstractNum w:abstractNumId="7" w15:restartNumberingAfterBreak="0">
+  <w:abstractNum w:abstractNumId="17" w15:restartNumberingAfterBreak="0">
     <w:nsid w:val="611365D4"/>
     <w:multiLevelType w:val="multilevel"/>
     <w:tmpl w:val="7AA23C38"/>
@@ -3129,7 +4952,7 @@
       </w:rPr>
     </w:lvl>
   </w:abstractNum>
-  <w:abstractNum w:abstractNumId="8" w15:restartNumberingAfterBreak="0">
+  <w:abstractNum w:abstractNumId="18" w15:restartNumberingAfterBreak="0">
     <w:nsid w:val="7C5522DB"/>
     <w:multiLevelType w:val="multilevel"/>
     <w:tmpl w:val="E8EA018E"/>
@@ -3278,7 +5101,7 @@
       </w:rPr>
     </w:lvl>
   </w:abstractNum>
-  <w:abstractNum w:abstractNumId="9" w15:restartNumberingAfterBreak="0">
+  <w:abstractNum w:abstractNumId="19" w15:restartNumberingAfterBreak="0">
     <w:nsid w:val="7F0F32C6"/>
     <w:multiLevelType w:val="multilevel"/>
     <w:tmpl w:val="085C2118"/>
@@ -3428,34 +5251,64 @@
     </w:lvl>
   </w:abstractNum>
   <w:num w:numId="1" w16cid:durableId="2002003958">
+    <w:abstractNumId w:val="16"/>
+  </w:num>
+  <w:num w:numId="2" w16cid:durableId="639923306">
+    <w:abstractNumId w:val="12"/>
+  </w:num>
+  <w:num w:numId="3" w16cid:durableId="371273694">
+    <w:abstractNumId w:val="9"/>
+  </w:num>
+  <w:num w:numId="4" w16cid:durableId="1545872702">
+    <w:abstractNumId w:val="2"/>
+  </w:num>
+  <w:num w:numId="5" w16cid:durableId="238486708">
+    <w:abstractNumId w:val="19"/>
+  </w:num>
+  <w:num w:numId="6" w16cid:durableId="1527213921">
+    <w:abstractNumId w:val="5"/>
+  </w:num>
+  <w:num w:numId="7" w16cid:durableId="1343389359">
     <w:abstractNumId w:val="6"/>
   </w:num>
-  <w:num w:numId="2" w16cid:durableId="639923306">
+  <w:num w:numId="8" w16cid:durableId="28921018">
+    <w:abstractNumId w:val="18"/>
+  </w:num>
+  <w:num w:numId="9" w16cid:durableId="1554274342">
+    <w:abstractNumId w:val="17"/>
+  </w:num>
+  <w:num w:numId="10" w16cid:durableId="235095700">
+    <w:abstractNumId w:val="15"/>
+  </w:num>
+  <w:num w:numId="11" w16cid:durableId="87897032">
+    <w:abstractNumId w:val="7"/>
+  </w:num>
+  <w:num w:numId="12" w16cid:durableId="1128354387">
+    <w:abstractNumId w:val="14"/>
+  </w:num>
+  <w:num w:numId="13" w16cid:durableId="2088646245">
+    <w:abstractNumId w:val="0"/>
+  </w:num>
+  <w:num w:numId="14" w16cid:durableId="208037248">
+    <w:abstractNumId w:val="1"/>
+  </w:num>
+  <w:num w:numId="15" w16cid:durableId="289630318">
+    <w:abstractNumId w:val="3"/>
+  </w:num>
+  <w:num w:numId="16" w16cid:durableId="1192495118">
     <w:abstractNumId w:val="4"/>
   </w:num>
-  <w:num w:numId="3" w16cid:durableId="371273694">
-    <w:abstractNumId w:val="3"/>
+  <w:num w:numId="17" w16cid:durableId="155733822">
+    <w:abstractNumId w:val="13"/>
   </w:num>
-  <w:num w:numId="4" w16cid:durableId="1545872702">
-    <w:abstractNumId w:val="0"/>
-  </w:num>
-  <w:num w:numId="5" w16cid:durableId="238486708">
-    <w:abstractNumId w:val="9"/>
-  </w:num>
-  <w:num w:numId="6" w16cid:durableId="1527213921">
-    <w:abstractNumId w:val="1"/>
-  </w:num>
-  <w:num w:numId="7" w16cid:durableId="1343389359">
-    <w:abstractNumId w:val="2"/>
-  </w:num>
-  <w:num w:numId="8" w16cid:durableId="28921018">
+  <w:num w:numId="18" w16cid:durableId="483014392">
     <w:abstractNumId w:val="8"/>
   </w:num>
-  <w:num w:numId="9" w16cid:durableId="1554274342">
-    <w:abstractNumId w:val="7"/>
+  <w:num w:numId="19" w16cid:durableId="1858809364">
+    <w:abstractNumId w:val="10"/>
   </w:num>
-  <w:num w:numId="10" w16cid:durableId="235095700">
-    <w:abstractNumId w:val="5"/>
+  <w:num w:numId="20" w16cid:durableId="1909344899">
+    <w:abstractNumId w:val="11"/>
   </w:num>
 </w:numbering>
 </file>
@@ -3860,7 +5713,7 @@
   <w:style w:type="paragraph" w:default="1" w:styleId="Normal">
     <w:name w:val="Normal"/>
     <w:qFormat/>
-    <w:rsid w:val="00D5042E"/>
+    <w:rsid w:val="00BC0A62"/>
   </w:style>
   <w:style w:type="paragraph" w:styleId="Ttulo1">
     <w:name w:val="heading 1"/>

</xml_diff>

<commit_message>
se agregan preubas funcionales
</commit_message>
<xml_diff>
--- a/doc/Proyecto_CRUD.docx
+++ b/doc/Proyecto_CRUD.docx
@@ -2689,6 +2689,7 @@
         <w:rPr>
           <w:b/>
           <w:bCs/>
+          <w:noProof/>
         </w:rPr>
         <w:drawing>
           <wp:inline distT="0" distB="0" distL="0" distR="0" wp14:anchorId="72C292E0" wp14:editId="6FF27F2D">
@@ -2809,6 +2810,7 @@
         <w:rPr>
           <w:b/>
           <w:bCs/>
+          <w:noProof/>
         </w:rPr>
         <w:drawing>
           <wp:inline distT="0" distB="0" distL="0" distR="0" wp14:anchorId="23DF3DB2" wp14:editId="15A9E358">
@@ -3133,21 +3135,7 @@
           <w:sz w:val="20"/>
           <w:szCs w:val="20"/>
         </w:rPr>
-        <w:t>Genera automáticamente códigos aleatorios (ej. A12, B45, F88)</w:t>
-      </w:r>
-      <w:r>
-        <w:rPr>
-          <w:sz w:val="20"/>
-          <w:szCs w:val="20"/>
-        </w:rPr>
-        <w:t xml:space="preserve"> y validación </w:t>
-      </w:r>
-      <w:r>
-        <w:rPr>
-          <w:sz w:val="20"/>
-          <w:szCs w:val="20"/>
-        </w:rPr>
-        <w:t>para evitar colisiones.</w:t>
+        <w:t>Genera automáticamente códigos aleatorios (ej. A12, B45, F88) y validación para evitar colisiones.</w:t>
       </w:r>
     </w:p>
     <w:p>
@@ -3197,21 +3185,7 @@
           <w:sz w:val="20"/>
           <w:szCs w:val="20"/>
         </w:rPr>
-        <w:t xml:space="preserve">Formulario para capturar Título, Autor, Género y </w:t>
-      </w:r>
-      <w:r>
-        <w:rPr>
-          <w:sz w:val="20"/>
-          <w:szCs w:val="20"/>
-        </w:rPr>
-        <w:t>Fecha</w:t>
-      </w:r>
-      <w:r>
-        <w:rPr>
-          <w:sz w:val="20"/>
-          <w:szCs w:val="20"/>
-        </w:rPr>
-        <w:t xml:space="preserve"> de publicación.</w:t>
+        <w:t>Formulario para capturar Título, Autor, Género y Fecha de publicación.</w:t>
       </w:r>
     </w:p>
     <w:p>
@@ -3340,6 +3314,7 @@
       </w:pPr>
       <w:r>
         <w:rPr>
+          <w:noProof/>
           <w:sz w:val="20"/>
           <w:szCs w:val="20"/>
         </w:rPr>
@@ -3621,16 +3596,7 @@
           <w:sz w:val="20"/>
           <w:szCs w:val="20"/>
         </w:rPr>
-        <w:t xml:space="preserve">1 </w:t>
-      </w:r>
-      <w:r>
-        <w:rPr>
-          <w:b/>
-          <w:bCs/>
-          <w:sz w:val="20"/>
-          <w:szCs w:val="20"/>
-        </w:rPr>
-        <w:t xml:space="preserve">AWS - Amazon Web </w:t>
+        <w:t xml:space="preserve">1 AWS - Amazon Web </w:t>
       </w:r>
       <w:proofErr w:type="spellStart"/>
       <w:r>
@@ -4291,6 +4257,7 @@
         <w:rPr>
           <w:b/>
           <w:bCs/>
+          <w:noProof/>
           <w:sz w:val="20"/>
           <w:szCs w:val="20"/>
         </w:rPr>
@@ -4356,16 +4323,7 @@
           <w:sz w:val="20"/>
           <w:szCs w:val="20"/>
         </w:rPr>
-        <w:t xml:space="preserve"> para </w:t>
-      </w:r>
-      <w:r>
-        <w:rPr>
-          <w:b/>
-          <w:bCs/>
-          <w:sz w:val="20"/>
-          <w:szCs w:val="20"/>
-        </w:rPr>
-        <w:t xml:space="preserve">el </w:t>
+        <w:t xml:space="preserve"> para el </w:t>
       </w:r>
       <w:proofErr w:type="spellStart"/>
       <w:r>
@@ -4412,13 +4370,14 @@
         <w:rPr>
           <w:b/>
           <w:bCs/>
+          <w:noProof/>
           <w:sz w:val="20"/>
           <w:szCs w:val="20"/>
         </w:rPr>
         <w:drawing>
-          <wp:inline distT="0" distB="0" distL="0" distR="0" wp14:anchorId="38741C47" wp14:editId="0952A223">
-            <wp:extent cx="5554639" cy="1698625"/>
-            <wp:effectExtent l="0" t="0" r="8255" b="0"/>
+          <wp:inline distT="0" distB="0" distL="0" distR="0" wp14:anchorId="38741C47" wp14:editId="7B3BC080">
+            <wp:extent cx="5552875" cy="1050877"/>
+            <wp:effectExtent l="0" t="0" r="0" b="0"/>
             <wp:docPr id="171593418" name="Imagen 1"/>
             <wp:cNvGraphicFramePr>
               <a:graphicFrameLocks xmlns:a="http://schemas.openxmlformats.org/drawingml/2006/main" noChangeAspect="1"/>
@@ -4432,7 +4391,7 @@
                   </pic:nvPicPr>
                   <pic:blipFill rotWithShape="1">
                     <a:blip r:embed="rId15"/>
-                    <a:srcRect b="26038"/>
+                    <a:srcRect t="4458" b="49770"/>
                     <a:stretch>
                       <a:fillRect/>
                     </a:stretch>
@@ -4440,7 +4399,7 @@
                   <pic:spPr bwMode="auto">
                     <a:xfrm>
                       <a:off x="0" y="0"/>
-                      <a:ext cx="5571833" cy="1703883"/>
+                      <a:ext cx="5571833" cy="1054465"/>
                     </a:xfrm>
                     <a:prstGeom prst="rect">
                       <a:avLst/>
@@ -4470,16 +4429,6 @@
           <w:szCs w:val="20"/>
         </w:rPr>
       </w:pPr>
-    </w:p>
-    <w:p>
-      <w:pPr>
-        <w:rPr>
-          <w:b/>
-          <w:bCs/>
-          <w:sz w:val="20"/>
-          <w:szCs w:val="20"/>
-        </w:rPr>
-      </w:pPr>
       <w:r>
         <w:rPr>
           <w:b/>
@@ -4489,6 +4438,1351 @@
         </w:rPr>
         <w:t>10. Pruebas funcionales BE y FE</w:t>
       </w:r>
+    </w:p>
+    <w:p>
+      <w:pPr>
+        <w:rPr>
+          <w:b/>
+          <w:bCs/>
+          <w:sz w:val="20"/>
+          <w:szCs w:val="20"/>
+        </w:rPr>
+      </w:pPr>
+      <w:r>
+        <w:rPr>
+          <w:b/>
+          <w:bCs/>
+          <w:sz w:val="20"/>
+          <w:szCs w:val="20"/>
+        </w:rPr>
+        <w:t xml:space="preserve">1 </w:t>
+      </w:r>
+      <w:proofErr w:type="gramStart"/>
+      <w:r>
+        <w:rPr>
+          <w:b/>
+          <w:bCs/>
+          <w:sz w:val="20"/>
+          <w:szCs w:val="20"/>
+        </w:rPr>
+        <w:t>Crear</w:t>
+      </w:r>
+      <w:proofErr w:type="gramEnd"/>
+      <w:r>
+        <w:rPr>
+          <w:b/>
+          <w:bCs/>
+          <w:sz w:val="20"/>
+          <w:szCs w:val="20"/>
+        </w:rPr>
+        <w:t xml:space="preserve"> libro</w:t>
+      </w:r>
+    </w:p>
+    <w:p>
+      <w:pPr>
+        <w:ind w:left="708"/>
+        <w:rPr>
+          <w:sz w:val="20"/>
+          <w:szCs w:val="20"/>
+        </w:rPr>
+      </w:pPr>
+      <w:r>
+        <w:rPr>
+          <w:sz w:val="20"/>
+          <w:szCs w:val="20"/>
+        </w:rPr>
+        <w:t>"titulo": "Cien años de soledad",</w:t>
+      </w:r>
+    </w:p>
+    <w:p>
+      <w:pPr>
+        <w:ind w:left="708"/>
+        <w:rPr>
+          <w:sz w:val="20"/>
+          <w:szCs w:val="20"/>
+        </w:rPr>
+      </w:pPr>
+      <w:r>
+        <w:rPr>
+          <w:sz w:val="20"/>
+          <w:szCs w:val="20"/>
+        </w:rPr>
+        <w:t xml:space="preserve"> "autor": "Gabriel Garc</w:t>
+      </w:r>
+      <w:r>
+        <w:rPr>
+          <w:sz w:val="20"/>
+          <w:szCs w:val="20"/>
+        </w:rPr>
+        <w:t>i</w:t>
+      </w:r>
+      <w:r>
+        <w:rPr>
+          <w:sz w:val="20"/>
+          <w:szCs w:val="20"/>
+        </w:rPr>
+        <w:t>a M</w:t>
+      </w:r>
+      <w:r>
+        <w:rPr>
+          <w:sz w:val="20"/>
+          <w:szCs w:val="20"/>
+        </w:rPr>
+        <w:t>a</w:t>
+      </w:r>
+      <w:r>
+        <w:rPr>
+          <w:sz w:val="20"/>
+          <w:szCs w:val="20"/>
+        </w:rPr>
+        <w:t>rquez",</w:t>
+      </w:r>
+    </w:p>
+    <w:p>
+      <w:pPr>
+        <w:ind w:left="708"/>
+        <w:rPr>
+          <w:sz w:val="20"/>
+          <w:szCs w:val="20"/>
+        </w:rPr>
+      </w:pPr>
+      <w:r>
+        <w:rPr>
+          <w:sz w:val="20"/>
+          <w:szCs w:val="20"/>
+        </w:rPr>
+        <w:t xml:space="preserve"> "genero": "Realismo </w:t>
+      </w:r>
+      <w:proofErr w:type="spellStart"/>
+      <w:r>
+        <w:rPr>
+          <w:sz w:val="20"/>
+          <w:szCs w:val="20"/>
+        </w:rPr>
+        <w:t>m</w:t>
+      </w:r>
+      <w:r>
+        <w:rPr>
+          <w:sz w:val="20"/>
+          <w:szCs w:val="20"/>
+        </w:rPr>
+        <w:t>a</w:t>
+      </w:r>
+      <w:r>
+        <w:rPr>
+          <w:sz w:val="20"/>
+          <w:szCs w:val="20"/>
+        </w:rPr>
+        <w:t>gico</w:t>
+      </w:r>
+      <w:proofErr w:type="spellEnd"/>
+      <w:r>
+        <w:rPr>
+          <w:sz w:val="20"/>
+          <w:szCs w:val="20"/>
+        </w:rPr>
+        <w:t>",</w:t>
+      </w:r>
+    </w:p>
+    <w:p>
+      <w:pPr>
+        <w:ind w:left="708"/>
+        <w:rPr>
+          <w:sz w:val="20"/>
+          <w:szCs w:val="20"/>
+        </w:rPr>
+      </w:pPr>
+      <w:r>
+        <w:rPr>
+          <w:sz w:val="20"/>
+          <w:szCs w:val="20"/>
+        </w:rPr>
+        <w:t xml:space="preserve"> "</w:t>
+      </w:r>
+      <w:proofErr w:type="spellStart"/>
+      <w:r>
+        <w:rPr>
+          <w:sz w:val="20"/>
+          <w:szCs w:val="20"/>
+        </w:rPr>
+        <w:t>Fecha_</w:t>
+      </w:r>
+      <w:r>
+        <w:rPr>
+          <w:sz w:val="20"/>
+          <w:szCs w:val="20"/>
+        </w:rPr>
+        <w:t>Publicacion</w:t>
+      </w:r>
+      <w:proofErr w:type="spellEnd"/>
+      <w:r>
+        <w:rPr>
+          <w:sz w:val="20"/>
+          <w:szCs w:val="20"/>
+        </w:rPr>
+        <w:t xml:space="preserve">": </w:t>
+      </w:r>
+      <w:r>
+        <w:rPr>
+          <w:sz w:val="20"/>
+          <w:szCs w:val="20"/>
+        </w:rPr>
+        <w:t>“</w:t>
+      </w:r>
+      <w:r>
+        <w:rPr>
+          <w:sz w:val="20"/>
+          <w:szCs w:val="20"/>
+        </w:rPr>
+        <w:t>1967</w:t>
+      </w:r>
+      <w:r>
+        <w:rPr>
+          <w:sz w:val="20"/>
+          <w:szCs w:val="20"/>
+        </w:rPr>
+        <w:t>-07-30</w:t>
+      </w:r>
+      <w:r>
+        <w:rPr>
+          <w:sz w:val="20"/>
+          <w:szCs w:val="20"/>
+        </w:rPr>
+        <w:t>”</w:t>
+      </w:r>
+    </w:p>
+    <w:p>
+      <w:pPr>
+        <w:rPr>
+          <w:sz w:val="20"/>
+          <w:szCs w:val="20"/>
+        </w:rPr>
+      </w:pPr>
+    </w:p>
+    <w:p>
+      <w:pPr>
+        <w:rPr>
+          <w:b/>
+          <w:bCs/>
+          <w:sz w:val="20"/>
+          <w:szCs w:val="20"/>
+        </w:rPr>
+      </w:pPr>
+    </w:p>
+    <w:p>
+      <w:pPr>
+        <w:rPr>
+          <w:b/>
+          <w:bCs/>
+          <w:sz w:val="20"/>
+          <w:szCs w:val="20"/>
+        </w:rPr>
+      </w:pPr>
+    </w:p>
+    <w:p>
+      <w:pPr>
+        <w:ind w:firstLine="708"/>
+        <w:rPr>
+          <w:sz w:val="20"/>
+          <w:szCs w:val="20"/>
+        </w:rPr>
+      </w:pPr>
+      <w:r>
+        <w:rPr>
+          <w:sz w:val="20"/>
+          <w:szCs w:val="20"/>
+        </w:rPr>
+        <w:lastRenderedPageBreak/>
+        <w:t>Resultado esperado:</w:t>
+      </w:r>
+      <w:r>
+        <w:rPr>
+          <w:sz w:val="20"/>
+          <w:szCs w:val="20"/>
+        </w:rPr>
+        <w:t xml:space="preserve"> </w:t>
+      </w:r>
+      <w:r>
+        <w:rPr>
+          <w:sz w:val="20"/>
+          <w:szCs w:val="20"/>
+        </w:rPr>
+        <w:t xml:space="preserve">Código HTTP: 201 </w:t>
+      </w:r>
+      <w:proofErr w:type="spellStart"/>
+      <w:r>
+        <w:rPr>
+          <w:sz w:val="20"/>
+          <w:szCs w:val="20"/>
+        </w:rPr>
+        <w:t>Created</w:t>
+      </w:r>
+      <w:proofErr w:type="spellEnd"/>
+    </w:p>
+    <w:p>
+      <w:pPr>
+        <w:ind w:left="708"/>
+        <w:rPr>
+          <w:sz w:val="20"/>
+          <w:szCs w:val="20"/>
+        </w:rPr>
+      </w:pPr>
+      <w:r>
+        <w:rPr>
+          <w:sz w:val="20"/>
+          <w:szCs w:val="20"/>
+        </w:rPr>
+        <w:t xml:space="preserve">  "id": 1,</w:t>
+      </w:r>
+    </w:p>
+    <w:p>
+      <w:pPr>
+        <w:ind w:left="708"/>
+        <w:rPr>
+          <w:sz w:val="20"/>
+          <w:szCs w:val="20"/>
+        </w:rPr>
+      </w:pPr>
+      <w:r>
+        <w:rPr>
+          <w:sz w:val="20"/>
+          <w:szCs w:val="20"/>
+        </w:rPr>
+        <w:t xml:space="preserve">  "</w:t>
+      </w:r>
+      <w:proofErr w:type="spellStart"/>
+      <w:r>
+        <w:rPr>
+          <w:sz w:val="20"/>
+          <w:szCs w:val="20"/>
+        </w:rPr>
+        <w:t>code</w:t>
+      </w:r>
+      <w:proofErr w:type="spellEnd"/>
+      <w:r>
+        <w:rPr>
+          <w:sz w:val="20"/>
+          <w:szCs w:val="20"/>
+        </w:rPr>
+        <w:t>": "</w:t>
+      </w:r>
+      <w:r>
+        <w:rPr>
+          <w:sz w:val="20"/>
+          <w:szCs w:val="20"/>
+          <w:highlight w:val="yellow"/>
+        </w:rPr>
+        <w:t>A12</w:t>
+      </w:r>
+      <w:proofErr w:type="gramStart"/>
+      <w:r>
+        <w:rPr>
+          <w:sz w:val="20"/>
+          <w:szCs w:val="20"/>
+        </w:rPr>
+        <w:t>",  /</w:t>
+      </w:r>
+      <w:proofErr w:type="gramEnd"/>
+      <w:r>
+        <w:rPr>
+          <w:sz w:val="20"/>
+          <w:szCs w:val="20"/>
+        </w:rPr>
+        <w:t>/ &lt;-- Verifica que cumpla el patrón: 1 letra (A-Z) + 2 dígitos (0-9)</w:t>
+      </w:r>
+    </w:p>
+    <w:p>
+      <w:pPr>
+        <w:ind w:left="708"/>
+        <w:rPr>
+          <w:sz w:val="20"/>
+          <w:szCs w:val="20"/>
+        </w:rPr>
+      </w:pPr>
+      <w:r>
+        <w:rPr>
+          <w:sz w:val="20"/>
+          <w:szCs w:val="20"/>
+        </w:rPr>
+        <w:t xml:space="preserve">  "titulo": "Cien años de soledad",</w:t>
+      </w:r>
+    </w:p>
+    <w:p>
+      <w:pPr>
+        <w:ind w:left="708"/>
+        <w:rPr>
+          <w:sz w:val="20"/>
+          <w:szCs w:val="20"/>
+        </w:rPr>
+      </w:pPr>
+      <w:r>
+        <w:rPr>
+          <w:sz w:val="20"/>
+          <w:szCs w:val="20"/>
+        </w:rPr>
+        <w:t xml:space="preserve">  "autor": "Gabriel García Márquez",</w:t>
+      </w:r>
+    </w:p>
+    <w:p>
+      <w:pPr>
+        <w:ind w:left="708"/>
+        <w:rPr>
+          <w:sz w:val="20"/>
+          <w:szCs w:val="20"/>
+        </w:rPr>
+      </w:pPr>
+      <w:r>
+        <w:rPr>
+          <w:sz w:val="20"/>
+          <w:szCs w:val="20"/>
+        </w:rPr>
+        <w:t xml:space="preserve">  "genero": "Realismo mágico",</w:t>
+      </w:r>
+    </w:p>
+    <w:p>
+      <w:pPr>
+        <w:ind w:left="708"/>
+        <w:rPr>
+          <w:sz w:val="20"/>
+          <w:szCs w:val="20"/>
+        </w:rPr>
+      </w:pPr>
+      <w:r>
+        <w:rPr>
+          <w:sz w:val="20"/>
+          <w:szCs w:val="20"/>
+        </w:rPr>
+        <w:t xml:space="preserve">  "</w:t>
+      </w:r>
+      <w:proofErr w:type="spellStart"/>
+      <w:r>
+        <w:rPr>
+          <w:sz w:val="20"/>
+          <w:szCs w:val="20"/>
+        </w:rPr>
+        <w:t>Fecha_</w:t>
+      </w:r>
+      <w:r>
+        <w:rPr>
+          <w:sz w:val="20"/>
+          <w:szCs w:val="20"/>
+        </w:rPr>
+        <w:t>Publicacion</w:t>
+      </w:r>
+      <w:proofErr w:type="spellEnd"/>
+      <w:r>
+        <w:rPr>
+          <w:sz w:val="20"/>
+          <w:szCs w:val="20"/>
+        </w:rPr>
+        <w:t xml:space="preserve">": </w:t>
+      </w:r>
+      <w:r>
+        <w:rPr>
+          <w:sz w:val="20"/>
+          <w:szCs w:val="20"/>
+        </w:rPr>
+        <w:t>“</w:t>
+      </w:r>
+      <w:r>
+        <w:rPr>
+          <w:sz w:val="20"/>
+          <w:szCs w:val="20"/>
+        </w:rPr>
+        <w:t>1967-07-30</w:t>
+      </w:r>
+      <w:r>
+        <w:rPr>
+          <w:sz w:val="20"/>
+          <w:szCs w:val="20"/>
+        </w:rPr>
+        <w:t>”</w:t>
+      </w:r>
+    </w:p>
+    <w:p>
+      <w:pPr>
+        <w:rPr>
+          <w:sz w:val="20"/>
+          <w:szCs w:val="20"/>
+        </w:rPr>
+      </w:pPr>
+      <w:r>
+        <w:rPr>
+          <w:sz w:val="20"/>
+          <w:szCs w:val="20"/>
+        </w:rPr>
+        <w:t>Respuesta del servidor: Lista que contiene al menos el libro recién creado</w:t>
+      </w:r>
+      <w:r>
+        <w:rPr>
+          <w:sz w:val="20"/>
+          <w:szCs w:val="20"/>
+        </w:rPr>
+        <w:t xml:space="preserve"> con código A12</w:t>
+      </w:r>
+    </w:p>
+    <w:p>
+      <w:pPr>
+        <w:rPr>
+          <w:b/>
+          <w:bCs/>
+          <w:sz w:val="20"/>
+          <w:szCs w:val="20"/>
+        </w:rPr>
+      </w:pPr>
+    </w:p>
+    <w:p>
+      <w:pPr>
+        <w:rPr>
+          <w:b/>
+          <w:bCs/>
+          <w:sz w:val="20"/>
+          <w:szCs w:val="20"/>
+        </w:rPr>
+      </w:pPr>
+      <w:r>
+        <w:rPr>
+          <w:b/>
+          <w:bCs/>
+          <w:sz w:val="20"/>
+          <w:szCs w:val="20"/>
+        </w:rPr>
+        <w:t>2</w:t>
+      </w:r>
+      <w:r>
+        <w:rPr>
+          <w:b/>
+          <w:bCs/>
+          <w:sz w:val="20"/>
+          <w:szCs w:val="20"/>
+        </w:rPr>
+        <w:t xml:space="preserve"> </w:t>
+      </w:r>
+      <w:proofErr w:type="gramStart"/>
+      <w:r>
+        <w:rPr>
+          <w:b/>
+          <w:bCs/>
+          <w:sz w:val="20"/>
+          <w:szCs w:val="20"/>
+        </w:rPr>
+        <w:t>Consultar</w:t>
+      </w:r>
+      <w:proofErr w:type="gramEnd"/>
+      <w:r>
+        <w:rPr>
+          <w:b/>
+          <w:bCs/>
+          <w:sz w:val="20"/>
+          <w:szCs w:val="20"/>
+        </w:rPr>
+        <w:t xml:space="preserve"> </w:t>
+      </w:r>
+      <w:r>
+        <w:rPr>
+          <w:b/>
+          <w:bCs/>
+          <w:sz w:val="20"/>
+          <w:szCs w:val="20"/>
+        </w:rPr>
+        <w:t xml:space="preserve">libro </w:t>
+      </w:r>
+      <w:r>
+        <w:rPr>
+          <w:b/>
+          <w:bCs/>
+          <w:sz w:val="20"/>
+          <w:szCs w:val="20"/>
+          <w:highlight w:val="yellow"/>
+        </w:rPr>
+        <w:t>A12</w:t>
+      </w:r>
+    </w:p>
+    <w:p>
+      <w:pPr>
+        <w:ind w:left="708"/>
+        <w:rPr>
+          <w:sz w:val="20"/>
+          <w:szCs w:val="20"/>
+        </w:rPr>
+      </w:pPr>
+      <w:r>
+        <w:rPr>
+          <w:sz w:val="20"/>
+          <w:szCs w:val="20"/>
+        </w:rPr>
+        <w:t>Buscar libro por código (GET /api/</w:t>
+      </w:r>
+      <w:proofErr w:type="spellStart"/>
+      <w:r>
+        <w:rPr>
+          <w:sz w:val="20"/>
+          <w:szCs w:val="20"/>
+        </w:rPr>
+        <w:t>search</w:t>
+      </w:r>
+      <w:r>
+        <w:rPr>
+          <w:sz w:val="20"/>
+          <w:szCs w:val="20"/>
+        </w:rPr>
+        <w:t>?code</w:t>
+      </w:r>
+      <w:proofErr w:type="spellEnd"/>
+      <w:r>
+        <w:rPr>
+          <w:sz w:val="20"/>
+          <w:szCs w:val="20"/>
+        </w:rPr>
+        <w:t>=A12)</w:t>
+      </w:r>
+    </w:p>
+    <w:p>
+      <w:pPr>
+        <w:ind w:left="708"/>
+        <w:rPr>
+          <w:sz w:val="20"/>
+          <w:szCs w:val="20"/>
+        </w:rPr>
+      </w:pPr>
+      <w:r>
+        <w:rPr>
+          <w:sz w:val="20"/>
+          <w:szCs w:val="20"/>
+        </w:rPr>
+        <w:t>Resultado esperado:</w:t>
+      </w:r>
+      <w:r>
+        <w:rPr>
+          <w:sz w:val="20"/>
+          <w:szCs w:val="20"/>
+        </w:rPr>
+        <w:t xml:space="preserve"> </w:t>
+      </w:r>
+      <w:r>
+        <w:rPr>
+          <w:sz w:val="20"/>
+          <w:szCs w:val="20"/>
+        </w:rPr>
+        <w:t>Código HTTP: 200 OK</w:t>
+      </w:r>
+    </w:p>
+    <w:p>
+      <w:pPr>
+        <w:ind w:left="708"/>
+        <w:rPr>
+          <w:sz w:val="20"/>
+          <w:szCs w:val="20"/>
+        </w:rPr>
+      </w:pPr>
+      <w:r>
+        <w:rPr>
+          <w:sz w:val="20"/>
+          <w:szCs w:val="20"/>
+        </w:rPr>
+        <w:t>Respuesta del servidor: Devuelve los detalles exactos del libro con código A12</w:t>
+      </w:r>
+    </w:p>
+    <w:p>
+      <w:pPr>
+        <w:rPr>
+          <w:b/>
+          <w:bCs/>
+          <w:sz w:val="20"/>
+          <w:szCs w:val="20"/>
+        </w:rPr>
+      </w:pPr>
+    </w:p>
+    <w:p>
+      <w:pPr>
+        <w:rPr>
+          <w:b/>
+          <w:bCs/>
+          <w:sz w:val="20"/>
+          <w:szCs w:val="20"/>
+        </w:rPr>
+      </w:pPr>
+      <w:r>
+        <w:rPr>
+          <w:b/>
+          <w:bCs/>
+          <w:sz w:val="20"/>
+          <w:szCs w:val="20"/>
+        </w:rPr>
+        <w:t>3</w:t>
+      </w:r>
+      <w:r>
+        <w:rPr>
+          <w:b/>
+          <w:bCs/>
+          <w:sz w:val="20"/>
+          <w:szCs w:val="20"/>
+        </w:rPr>
+        <w:t xml:space="preserve"> </w:t>
+      </w:r>
+      <w:proofErr w:type="gramStart"/>
+      <w:r>
+        <w:rPr>
+          <w:b/>
+          <w:bCs/>
+          <w:sz w:val="20"/>
+          <w:szCs w:val="20"/>
+        </w:rPr>
+        <w:t>Actualizar</w:t>
+      </w:r>
+      <w:proofErr w:type="gramEnd"/>
+      <w:r>
+        <w:rPr>
+          <w:b/>
+          <w:bCs/>
+          <w:sz w:val="20"/>
+          <w:szCs w:val="20"/>
+        </w:rPr>
+        <w:t xml:space="preserve"> libro</w:t>
+      </w:r>
+      <w:r>
+        <w:rPr>
+          <w:b/>
+          <w:bCs/>
+          <w:sz w:val="20"/>
+          <w:szCs w:val="20"/>
+        </w:rPr>
+        <w:t xml:space="preserve"> </w:t>
+      </w:r>
+      <w:r>
+        <w:rPr>
+          <w:b/>
+          <w:bCs/>
+          <w:sz w:val="20"/>
+          <w:szCs w:val="20"/>
+          <w:highlight w:val="yellow"/>
+        </w:rPr>
+        <w:t>A12</w:t>
+      </w:r>
+    </w:p>
+    <w:p>
+      <w:pPr>
+        <w:ind w:left="708"/>
+        <w:rPr>
+          <w:sz w:val="20"/>
+          <w:szCs w:val="20"/>
+        </w:rPr>
+      </w:pPr>
+      <w:r>
+        <w:rPr>
+          <w:sz w:val="20"/>
+          <w:szCs w:val="20"/>
+        </w:rPr>
+        <w:t xml:space="preserve">  "titulo": "</w:t>
+      </w:r>
+      <w:r>
+        <w:rPr>
+          <w:sz w:val="20"/>
+          <w:szCs w:val="20"/>
+          <w:highlight w:val="yellow"/>
+        </w:rPr>
+        <w:t>Cien años de soledad (Edición Ilustrada)</w:t>
+      </w:r>
+      <w:r>
+        <w:rPr>
+          <w:sz w:val="20"/>
+          <w:szCs w:val="20"/>
+        </w:rPr>
+        <w:t>",</w:t>
+      </w:r>
+    </w:p>
+    <w:p>
+      <w:pPr>
+        <w:ind w:left="708"/>
+        <w:rPr>
+          <w:sz w:val="20"/>
+          <w:szCs w:val="20"/>
+        </w:rPr>
+      </w:pPr>
+      <w:r>
+        <w:rPr>
+          <w:sz w:val="20"/>
+          <w:szCs w:val="20"/>
+        </w:rPr>
+        <w:t xml:space="preserve">  "autor": "Gabriel García Márquez",</w:t>
+      </w:r>
+    </w:p>
+    <w:p>
+      <w:pPr>
+        <w:ind w:left="708"/>
+        <w:rPr>
+          <w:sz w:val="20"/>
+          <w:szCs w:val="20"/>
+        </w:rPr>
+      </w:pPr>
+      <w:r>
+        <w:rPr>
+          <w:sz w:val="20"/>
+          <w:szCs w:val="20"/>
+        </w:rPr>
+        <w:t xml:space="preserve">  "genero": "Realismo mágico",</w:t>
+      </w:r>
+    </w:p>
+    <w:p>
+      <w:pPr>
+        <w:ind w:left="708"/>
+        <w:rPr>
+          <w:sz w:val="20"/>
+          <w:szCs w:val="20"/>
+        </w:rPr>
+      </w:pPr>
+      <w:r>
+        <w:rPr>
+          <w:sz w:val="20"/>
+          <w:szCs w:val="20"/>
+        </w:rPr>
+        <w:t xml:space="preserve">  "</w:t>
+      </w:r>
+      <w:proofErr w:type="spellStart"/>
+      <w:r>
+        <w:rPr>
+          <w:sz w:val="20"/>
+          <w:szCs w:val="20"/>
+        </w:rPr>
+        <w:t>Fecha_</w:t>
+      </w:r>
+      <w:r>
+        <w:rPr>
+          <w:sz w:val="20"/>
+          <w:szCs w:val="20"/>
+        </w:rPr>
+        <w:t>Publicacion</w:t>
+      </w:r>
+      <w:proofErr w:type="spellEnd"/>
+      <w:r>
+        <w:rPr>
+          <w:sz w:val="20"/>
+          <w:szCs w:val="20"/>
+        </w:rPr>
+        <w:t xml:space="preserve">": </w:t>
+      </w:r>
+      <w:r>
+        <w:rPr>
+          <w:sz w:val="20"/>
+          <w:szCs w:val="20"/>
+        </w:rPr>
+        <w:t>“</w:t>
+      </w:r>
+      <w:r>
+        <w:rPr>
+          <w:sz w:val="20"/>
+          <w:szCs w:val="20"/>
+          <w:highlight w:val="yellow"/>
+        </w:rPr>
+        <w:t>1967-07-3</w:t>
+      </w:r>
+      <w:r>
+        <w:rPr>
+          <w:sz w:val="20"/>
+          <w:szCs w:val="20"/>
+          <w:highlight w:val="yellow"/>
+        </w:rPr>
+        <w:t>0</w:t>
+      </w:r>
+      <w:r>
+        <w:rPr>
+          <w:sz w:val="20"/>
+          <w:szCs w:val="20"/>
+        </w:rPr>
+        <w:t>”</w:t>
+      </w:r>
+    </w:p>
+    <w:p>
+      <w:pPr>
+        <w:ind w:left="708"/>
+        <w:rPr>
+          <w:sz w:val="20"/>
+          <w:szCs w:val="20"/>
+        </w:rPr>
+      </w:pPr>
+      <w:r>
+        <w:rPr>
+          <w:sz w:val="20"/>
+          <w:szCs w:val="20"/>
+        </w:rPr>
+        <w:t>Resultado esperado:</w:t>
+      </w:r>
+      <w:r>
+        <w:rPr>
+          <w:sz w:val="20"/>
+          <w:szCs w:val="20"/>
+        </w:rPr>
+        <w:t xml:space="preserve"> </w:t>
+      </w:r>
+      <w:r>
+        <w:rPr>
+          <w:sz w:val="20"/>
+          <w:szCs w:val="20"/>
+        </w:rPr>
+        <w:t>Código HTTP: 200 OK</w:t>
+      </w:r>
+    </w:p>
+    <w:p>
+      <w:pPr>
+        <w:ind w:left="708"/>
+        <w:rPr>
+          <w:sz w:val="20"/>
+          <w:szCs w:val="20"/>
+        </w:rPr>
+      </w:pPr>
+      <w:r>
+        <w:rPr>
+          <w:sz w:val="20"/>
+          <w:szCs w:val="20"/>
+        </w:rPr>
+        <w:t xml:space="preserve">  "id": 1,</w:t>
+      </w:r>
+    </w:p>
+    <w:p>
+      <w:pPr>
+        <w:ind w:left="708"/>
+        <w:rPr>
+          <w:sz w:val="20"/>
+          <w:szCs w:val="20"/>
+        </w:rPr>
+      </w:pPr>
+      <w:r>
+        <w:rPr>
+          <w:sz w:val="20"/>
+          <w:szCs w:val="20"/>
+        </w:rPr>
+        <w:t xml:space="preserve">  "</w:t>
+      </w:r>
+      <w:proofErr w:type="spellStart"/>
+      <w:r>
+        <w:rPr>
+          <w:sz w:val="20"/>
+          <w:szCs w:val="20"/>
+        </w:rPr>
+        <w:t>code</w:t>
+      </w:r>
+      <w:proofErr w:type="spellEnd"/>
+      <w:r>
+        <w:rPr>
+          <w:sz w:val="20"/>
+          <w:szCs w:val="20"/>
+        </w:rPr>
+        <w:t>": "A12</w:t>
+      </w:r>
+      <w:proofErr w:type="gramStart"/>
+      <w:r>
+        <w:rPr>
+          <w:sz w:val="20"/>
+          <w:szCs w:val="20"/>
+        </w:rPr>
+        <w:t>",  /</w:t>
+      </w:r>
+      <w:proofErr w:type="gramEnd"/>
+      <w:r>
+        <w:rPr>
+          <w:sz w:val="20"/>
+          <w:szCs w:val="20"/>
+        </w:rPr>
+        <w:t>/ &lt;-- El código DEBE mantenerse intacto</w:t>
+      </w:r>
+    </w:p>
+    <w:p>
+      <w:pPr>
+        <w:ind w:left="708"/>
+        <w:rPr>
+          <w:sz w:val="20"/>
+          <w:szCs w:val="20"/>
+        </w:rPr>
+      </w:pPr>
+      <w:r>
+        <w:rPr>
+          <w:sz w:val="20"/>
+          <w:szCs w:val="20"/>
+        </w:rPr>
+        <w:t xml:space="preserve">  "titulo": "</w:t>
+      </w:r>
+      <w:r>
+        <w:rPr>
+          <w:sz w:val="20"/>
+          <w:szCs w:val="20"/>
+          <w:highlight w:val="yellow"/>
+        </w:rPr>
+        <w:t>Cien años de soledad (Edición Ilustrada)</w:t>
+      </w:r>
+      <w:r>
+        <w:rPr>
+          <w:sz w:val="20"/>
+          <w:szCs w:val="20"/>
+        </w:rPr>
+        <w:t>",</w:t>
+      </w:r>
+    </w:p>
+    <w:p>
+      <w:pPr>
+        <w:ind w:left="708"/>
+        <w:rPr>
+          <w:sz w:val="20"/>
+          <w:szCs w:val="20"/>
+        </w:rPr>
+      </w:pPr>
+      <w:r>
+        <w:rPr>
+          <w:sz w:val="20"/>
+          <w:szCs w:val="20"/>
+        </w:rPr>
+        <w:t xml:space="preserve">  "autor": "Gabriel García Márquez",</w:t>
+      </w:r>
+    </w:p>
+    <w:p>
+      <w:pPr>
+        <w:ind w:left="708"/>
+        <w:rPr>
+          <w:sz w:val="20"/>
+          <w:szCs w:val="20"/>
+        </w:rPr>
+      </w:pPr>
+      <w:r>
+        <w:rPr>
+          <w:sz w:val="20"/>
+          <w:szCs w:val="20"/>
+        </w:rPr>
+        <w:t xml:space="preserve">  "genero": "Realismo mágico",</w:t>
+      </w:r>
+    </w:p>
+    <w:p>
+      <w:pPr>
+        <w:ind w:left="708"/>
+        <w:rPr>
+          <w:sz w:val="20"/>
+          <w:szCs w:val="20"/>
+        </w:rPr>
+      </w:pPr>
+      <w:r>
+        <w:rPr>
+          <w:sz w:val="20"/>
+          <w:szCs w:val="20"/>
+        </w:rPr>
+        <w:t xml:space="preserve">  "</w:t>
+      </w:r>
+      <w:proofErr w:type="spellStart"/>
+      <w:r>
+        <w:rPr>
+          <w:sz w:val="20"/>
+          <w:szCs w:val="20"/>
+        </w:rPr>
+        <w:t>Fecha_</w:t>
+      </w:r>
+      <w:r>
+        <w:rPr>
+          <w:sz w:val="20"/>
+          <w:szCs w:val="20"/>
+        </w:rPr>
+        <w:t>Publicacion</w:t>
+      </w:r>
+      <w:proofErr w:type="spellEnd"/>
+      <w:r>
+        <w:rPr>
+          <w:sz w:val="20"/>
+          <w:szCs w:val="20"/>
+        </w:rPr>
+        <w:t xml:space="preserve">": </w:t>
+      </w:r>
+      <w:r>
+        <w:rPr>
+          <w:sz w:val="20"/>
+          <w:szCs w:val="20"/>
+        </w:rPr>
+        <w:t>“</w:t>
+      </w:r>
+      <w:r>
+        <w:rPr>
+          <w:sz w:val="20"/>
+          <w:szCs w:val="20"/>
+          <w:highlight w:val="yellow"/>
+        </w:rPr>
+        <w:t>1967-07-31</w:t>
+      </w:r>
+      <w:r>
+        <w:rPr>
+          <w:sz w:val="20"/>
+          <w:szCs w:val="20"/>
+        </w:rPr>
+        <w:t>”</w:t>
+      </w:r>
+    </w:p>
+    <w:p>
+      <w:pPr>
+        <w:ind w:left="708"/>
+        <w:rPr>
+          <w:sz w:val="20"/>
+          <w:szCs w:val="20"/>
+        </w:rPr>
+      </w:pPr>
+      <w:r>
+        <w:rPr>
+          <w:sz w:val="20"/>
+          <w:szCs w:val="20"/>
+        </w:rPr>
+        <w:t>Se modifican t</w:t>
+      </w:r>
+      <w:r>
+        <w:rPr>
+          <w:sz w:val="20"/>
+          <w:szCs w:val="20"/>
+        </w:rPr>
+        <w:t>í</w:t>
+      </w:r>
+      <w:r>
+        <w:rPr>
+          <w:sz w:val="20"/>
+          <w:szCs w:val="20"/>
+        </w:rPr>
+        <w:t xml:space="preserve">tulo y </w:t>
+      </w:r>
+      <w:proofErr w:type="spellStart"/>
+      <w:r>
+        <w:rPr>
+          <w:sz w:val="20"/>
+          <w:szCs w:val="20"/>
+        </w:rPr>
+        <w:t>Fecha_</w:t>
+      </w:r>
+      <w:r>
+        <w:rPr>
+          <w:sz w:val="20"/>
+          <w:szCs w:val="20"/>
+        </w:rPr>
+        <w:t>Publicacion</w:t>
+      </w:r>
+      <w:proofErr w:type="spellEnd"/>
+      <w:r>
+        <w:rPr>
+          <w:sz w:val="20"/>
+          <w:szCs w:val="20"/>
+        </w:rPr>
+        <w:t xml:space="preserve"> en MySQL.</w:t>
+      </w:r>
+    </w:p>
+    <w:p>
+      <w:pPr>
+        <w:ind w:left="708"/>
+        <w:rPr>
+          <w:sz w:val="20"/>
+          <w:szCs w:val="20"/>
+        </w:rPr>
+      </w:pPr>
+      <w:r>
+        <w:rPr>
+          <w:sz w:val="20"/>
+          <w:szCs w:val="20"/>
+        </w:rPr>
+        <w:t xml:space="preserve">El identificador/código original (A12) no se </w:t>
+      </w:r>
+      <w:proofErr w:type="spellStart"/>
+      <w:r>
+        <w:rPr>
+          <w:sz w:val="20"/>
+          <w:szCs w:val="20"/>
+        </w:rPr>
+        <w:t>sobreescribe</w:t>
+      </w:r>
+      <w:proofErr w:type="spellEnd"/>
+      <w:r>
+        <w:rPr>
+          <w:sz w:val="20"/>
+          <w:szCs w:val="20"/>
+        </w:rPr>
+        <w:t xml:space="preserve"> ni cambia.</w:t>
+      </w:r>
+    </w:p>
+    <w:p>
+      <w:pPr>
+        <w:ind w:left="708"/>
+        <w:rPr>
+          <w:b/>
+          <w:bCs/>
+          <w:sz w:val="20"/>
+          <w:szCs w:val="20"/>
+        </w:rPr>
+      </w:pPr>
+    </w:p>
+    <w:p>
+      <w:pPr>
+        <w:ind w:left="708"/>
+        <w:rPr>
+          <w:b/>
+          <w:bCs/>
+          <w:sz w:val="20"/>
+          <w:szCs w:val="20"/>
+        </w:rPr>
+      </w:pPr>
+      <w:r>
+        <w:rPr>
+          <w:b/>
+          <w:bCs/>
+          <w:sz w:val="20"/>
+          <w:szCs w:val="20"/>
+        </w:rPr>
+        <w:lastRenderedPageBreak/>
+        <w:t xml:space="preserve">5. Eliminar el libro </w:t>
+      </w:r>
+    </w:p>
+    <w:p>
+      <w:pPr>
+        <w:ind w:left="708"/>
+        <w:rPr>
+          <w:sz w:val="20"/>
+          <w:szCs w:val="20"/>
+        </w:rPr>
+      </w:pPr>
+      <w:r>
+        <w:rPr>
+          <w:sz w:val="20"/>
+          <w:szCs w:val="20"/>
+        </w:rPr>
+        <w:t>Buscar libro por código (GET /api/</w:t>
+      </w:r>
+      <w:proofErr w:type="spellStart"/>
+      <w:r>
+        <w:rPr>
+          <w:sz w:val="20"/>
+          <w:szCs w:val="20"/>
+        </w:rPr>
+        <w:t>search?code</w:t>
+      </w:r>
+      <w:proofErr w:type="spellEnd"/>
+      <w:r>
+        <w:rPr>
+          <w:sz w:val="20"/>
+          <w:szCs w:val="20"/>
+        </w:rPr>
+        <w:t>=</w:t>
+      </w:r>
+      <w:r>
+        <w:rPr>
+          <w:sz w:val="20"/>
+          <w:szCs w:val="20"/>
+          <w:highlight w:val="yellow"/>
+        </w:rPr>
+        <w:t>A12</w:t>
+      </w:r>
+      <w:r>
+        <w:rPr>
+          <w:sz w:val="20"/>
+          <w:szCs w:val="20"/>
+        </w:rPr>
+        <w:t>)</w:t>
+      </w:r>
+    </w:p>
+    <w:p>
+      <w:pPr>
+        <w:ind w:left="708"/>
+        <w:rPr>
+          <w:sz w:val="20"/>
+          <w:szCs w:val="20"/>
+        </w:rPr>
+      </w:pPr>
+      <w:r>
+        <w:rPr>
+          <w:sz w:val="20"/>
+          <w:szCs w:val="20"/>
+        </w:rPr>
+        <w:t>Resultado esperado:</w:t>
+      </w:r>
+      <w:r>
+        <w:rPr>
+          <w:sz w:val="20"/>
+          <w:szCs w:val="20"/>
+        </w:rPr>
+        <w:t xml:space="preserve"> Mensaje de advertencia antes de eliminar el </w:t>
+      </w:r>
+      <w:proofErr w:type="spellStart"/>
+      <w:r>
+        <w:rPr>
+          <w:sz w:val="20"/>
+          <w:szCs w:val="20"/>
+        </w:rPr>
+        <w:t>code</w:t>
+      </w:r>
+      <w:proofErr w:type="spellEnd"/>
+      <w:r>
+        <w:rPr>
+          <w:sz w:val="20"/>
+          <w:szCs w:val="20"/>
+        </w:rPr>
+        <w:t xml:space="preserve"> </w:t>
+      </w:r>
+      <w:r>
+        <w:rPr>
+          <w:sz w:val="20"/>
+          <w:szCs w:val="20"/>
+          <w:highlight w:val="yellow"/>
+        </w:rPr>
+        <w:t>A12</w:t>
+      </w:r>
+    </w:p>
+    <w:p>
+      <w:pPr>
+        <w:ind w:left="708"/>
+        <w:rPr>
+          <w:sz w:val="20"/>
+          <w:szCs w:val="20"/>
+        </w:rPr>
+      </w:pPr>
+      <w:r>
+        <w:rPr>
+          <w:sz w:val="20"/>
+          <w:szCs w:val="20"/>
+        </w:rPr>
+        <w:t>C</w:t>
+      </w:r>
+      <w:r>
+        <w:rPr>
+          <w:sz w:val="20"/>
+          <w:szCs w:val="20"/>
+        </w:rPr>
+        <w:t>onfirmando que el registro se eliminó correctamente de la base de datos MySQL).</w:t>
+      </w:r>
+    </w:p>
+    <w:p>
+      <w:pPr>
+        <w:rPr>
+          <w:sz w:val="20"/>
+          <w:szCs w:val="20"/>
+        </w:rPr>
+      </w:pPr>
+    </w:p>
+    <w:p>
+      <w:pPr>
+        <w:rPr>
+          <w:sz w:val="20"/>
+          <w:szCs w:val="20"/>
+        </w:rPr>
+      </w:pPr>
+    </w:p>
+    <w:p>
+      <w:pPr>
+        <w:rPr>
+          <w:sz w:val="20"/>
+          <w:szCs w:val="20"/>
+        </w:rPr>
+      </w:pPr>
+    </w:p>
+    <w:p>
+      <w:pPr>
+        <w:rPr>
+          <w:sz w:val="20"/>
+          <w:szCs w:val="20"/>
+        </w:rPr>
+      </w:pPr>
+    </w:p>
+    <w:p>
+      <w:pPr>
+        <w:rPr>
+          <w:sz w:val="20"/>
+          <w:szCs w:val="20"/>
+        </w:rPr>
+      </w:pPr>
     </w:p>
     <w:sectPr>
       <w:pgSz w:w="12240" w:h="15840"/>
@@ -5397,6 +6691,155 @@
     </w:lvl>
   </w:abstractNum>
   <w:abstractNum w:abstractNumId="6" w15:restartNumberingAfterBreak="0">
+    <w:nsid w:val="16736D65"/>
+    <w:multiLevelType w:val="multilevel"/>
+    <w:tmpl w:val="0C80D2B0"/>
+    <w:lvl w:ilvl="0">
+      <w:start w:val="1"/>
+      <w:numFmt w:val="bullet"/>
+      <w:lvlText w:val=""/>
+      <w:lvlJc w:val="left"/>
+      <w:pPr>
+        <w:tabs>
+          <w:tab w:val="num" w:pos="720"/>
+        </w:tabs>
+        <w:ind w:left="720" w:hanging="360"/>
+      </w:pPr>
+      <w:rPr>
+        <w:rFonts w:ascii="Symbol" w:hAnsi="Symbol" w:hint="default"/>
+        <w:sz w:val="20"/>
+      </w:rPr>
+    </w:lvl>
+    <w:lvl w:ilvl="1" w:tentative="1">
+      <w:start w:val="1"/>
+      <w:numFmt w:val="bullet"/>
+      <w:lvlText w:val="o"/>
+      <w:lvlJc w:val="left"/>
+      <w:pPr>
+        <w:tabs>
+          <w:tab w:val="num" w:pos="1440"/>
+        </w:tabs>
+        <w:ind w:left="1440" w:hanging="360"/>
+      </w:pPr>
+      <w:rPr>
+        <w:rFonts w:ascii="Courier New" w:hAnsi="Courier New" w:hint="default"/>
+        <w:sz w:val="20"/>
+      </w:rPr>
+    </w:lvl>
+    <w:lvl w:ilvl="2" w:tentative="1">
+      <w:start w:val="1"/>
+      <w:numFmt w:val="bullet"/>
+      <w:lvlText w:val=""/>
+      <w:lvlJc w:val="left"/>
+      <w:pPr>
+        <w:tabs>
+          <w:tab w:val="num" w:pos="2160"/>
+        </w:tabs>
+        <w:ind w:left="2160" w:hanging="360"/>
+      </w:pPr>
+      <w:rPr>
+        <w:rFonts w:ascii="Wingdings" w:hAnsi="Wingdings" w:hint="default"/>
+        <w:sz w:val="20"/>
+      </w:rPr>
+    </w:lvl>
+    <w:lvl w:ilvl="3" w:tentative="1">
+      <w:start w:val="1"/>
+      <w:numFmt w:val="bullet"/>
+      <w:lvlText w:val=""/>
+      <w:lvlJc w:val="left"/>
+      <w:pPr>
+        <w:tabs>
+          <w:tab w:val="num" w:pos="2880"/>
+        </w:tabs>
+        <w:ind w:left="2880" w:hanging="360"/>
+      </w:pPr>
+      <w:rPr>
+        <w:rFonts w:ascii="Wingdings" w:hAnsi="Wingdings" w:hint="default"/>
+        <w:sz w:val="20"/>
+      </w:rPr>
+    </w:lvl>
+    <w:lvl w:ilvl="4" w:tentative="1">
+      <w:start w:val="1"/>
+      <w:numFmt w:val="bullet"/>
+      <w:lvlText w:val=""/>
+      <w:lvlJc w:val="left"/>
+      <w:pPr>
+        <w:tabs>
+          <w:tab w:val="num" w:pos="3600"/>
+        </w:tabs>
+        <w:ind w:left="3600" w:hanging="360"/>
+      </w:pPr>
+      <w:rPr>
+        <w:rFonts w:ascii="Wingdings" w:hAnsi="Wingdings" w:hint="default"/>
+        <w:sz w:val="20"/>
+      </w:rPr>
+    </w:lvl>
+    <w:lvl w:ilvl="5" w:tentative="1">
+      <w:start w:val="1"/>
+      <w:numFmt w:val="bullet"/>
+      <w:lvlText w:val=""/>
+      <w:lvlJc w:val="left"/>
+      <w:pPr>
+        <w:tabs>
+          <w:tab w:val="num" w:pos="4320"/>
+        </w:tabs>
+        <w:ind w:left="4320" w:hanging="360"/>
+      </w:pPr>
+      <w:rPr>
+        <w:rFonts w:ascii="Wingdings" w:hAnsi="Wingdings" w:hint="default"/>
+        <w:sz w:val="20"/>
+      </w:rPr>
+    </w:lvl>
+    <w:lvl w:ilvl="6" w:tentative="1">
+      <w:start w:val="1"/>
+      <w:numFmt w:val="bullet"/>
+      <w:lvlText w:val=""/>
+      <w:lvlJc w:val="left"/>
+      <w:pPr>
+        <w:tabs>
+          <w:tab w:val="num" w:pos="5040"/>
+        </w:tabs>
+        <w:ind w:left="5040" w:hanging="360"/>
+      </w:pPr>
+      <w:rPr>
+        <w:rFonts w:ascii="Wingdings" w:hAnsi="Wingdings" w:hint="default"/>
+        <w:sz w:val="20"/>
+      </w:rPr>
+    </w:lvl>
+    <w:lvl w:ilvl="7" w:tentative="1">
+      <w:start w:val="1"/>
+      <w:numFmt w:val="bullet"/>
+      <w:lvlText w:val=""/>
+      <w:lvlJc w:val="left"/>
+      <w:pPr>
+        <w:tabs>
+          <w:tab w:val="num" w:pos="5760"/>
+        </w:tabs>
+        <w:ind w:left="5760" w:hanging="360"/>
+      </w:pPr>
+      <w:rPr>
+        <w:rFonts w:ascii="Wingdings" w:hAnsi="Wingdings" w:hint="default"/>
+        <w:sz w:val="20"/>
+      </w:rPr>
+    </w:lvl>
+    <w:lvl w:ilvl="8" w:tentative="1">
+      <w:start w:val="1"/>
+      <w:numFmt w:val="bullet"/>
+      <w:lvlText w:val=""/>
+      <w:lvlJc w:val="left"/>
+      <w:pPr>
+        <w:tabs>
+          <w:tab w:val="num" w:pos="6480"/>
+        </w:tabs>
+        <w:ind w:left="6480" w:hanging="360"/>
+      </w:pPr>
+      <w:rPr>
+        <w:rFonts w:ascii="Wingdings" w:hAnsi="Wingdings" w:hint="default"/>
+        <w:sz w:val="20"/>
+      </w:rPr>
+    </w:lvl>
+  </w:abstractNum>
+  <w:abstractNum w:abstractNumId="7" w15:restartNumberingAfterBreak="0">
     <w:nsid w:val="19D70AB3"/>
     <w:multiLevelType w:val="multilevel"/>
     <w:tmpl w:val="2F0EB2D2"/>
@@ -5545,7 +6988,7 @@
       </w:rPr>
     </w:lvl>
   </w:abstractNum>
-  <w:abstractNum w:abstractNumId="7" w15:restartNumberingAfterBreak="0">
+  <w:abstractNum w:abstractNumId="8" w15:restartNumberingAfterBreak="0">
     <w:nsid w:val="1D795BBD"/>
     <w:multiLevelType w:val="multilevel"/>
     <w:tmpl w:val="3ADA4428"/>
@@ -5694,7 +7137,7 @@
       </w:rPr>
     </w:lvl>
   </w:abstractNum>
-  <w:abstractNum w:abstractNumId="8" w15:restartNumberingAfterBreak="0">
+  <w:abstractNum w:abstractNumId="9" w15:restartNumberingAfterBreak="0">
     <w:nsid w:val="1E3B05F5"/>
     <w:multiLevelType w:val="multilevel"/>
     <w:tmpl w:val="69CAD054"/>
@@ -5843,7 +7286,7 @@
       </w:rPr>
     </w:lvl>
   </w:abstractNum>
-  <w:abstractNum w:abstractNumId="9" w15:restartNumberingAfterBreak="0">
+  <w:abstractNum w:abstractNumId="10" w15:restartNumberingAfterBreak="0">
     <w:nsid w:val="26E02332"/>
     <w:multiLevelType w:val="multilevel"/>
     <w:tmpl w:val="C0EA4D9A"/>
@@ -5992,7 +7435,7 @@
       </w:rPr>
     </w:lvl>
   </w:abstractNum>
-  <w:abstractNum w:abstractNumId="10" w15:restartNumberingAfterBreak="0">
+  <w:abstractNum w:abstractNumId="11" w15:restartNumberingAfterBreak="0">
     <w:nsid w:val="2DB4140A"/>
     <w:multiLevelType w:val="multilevel"/>
     <w:tmpl w:val="D698FD56"/>
@@ -6141,7 +7584,7 @@
       </w:rPr>
     </w:lvl>
   </w:abstractNum>
-  <w:abstractNum w:abstractNumId="11" w15:restartNumberingAfterBreak="0">
+  <w:abstractNum w:abstractNumId="12" w15:restartNumberingAfterBreak="0">
     <w:nsid w:val="308D5F5B"/>
     <w:multiLevelType w:val="multilevel"/>
     <w:tmpl w:val="C5945548"/>
@@ -6290,7 +7733,7 @@
       </w:rPr>
     </w:lvl>
   </w:abstractNum>
-  <w:abstractNum w:abstractNumId="12" w15:restartNumberingAfterBreak="0">
+  <w:abstractNum w:abstractNumId="13" w15:restartNumberingAfterBreak="0">
     <w:nsid w:val="309626F3"/>
     <w:multiLevelType w:val="multilevel"/>
     <w:tmpl w:val="D034EE4A"/>
@@ -6439,7 +7882,7 @@
       </w:rPr>
     </w:lvl>
   </w:abstractNum>
-  <w:abstractNum w:abstractNumId="13" w15:restartNumberingAfterBreak="0">
+  <w:abstractNum w:abstractNumId="14" w15:restartNumberingAfterBreak="0">
     <w:nsid w:val="30C1172E"/>
     <w:multiLevelType w:val="multilevel"/>
     <w:tmpl w:val="F5B852F6"/>
@@ -6588,7 +8031,7 @@
       </w:rPr>
     </w:lvl>
   </w:abstractNum>
-  <w:abstractNum w:abstractNumId="14" w15:restartNumberingAfterBreak="0">
+  <w:abstractNum w:abstractNumId="15" w15:restartNumberingAfterBreak="0">
     <w:nsid w:val="322E52B7"/>
     <w:multiLevelType w:val="multilevel"/>
     <w:tmpl w:val="F838414E"/>
@@ -6701,7 +8144,156 @@
       </w:rPr>
     </w:lvl>
   </w:abstractNum>
-  <w:abstractNum w:abstractNumId="15" w15:restartNumberingAfterBreak="0">
+  <w:abstractNum w:abstractNumId="16" w15:restartNumberingAfterBreak="0">
+    <w:nsid w:val="334D422F"/>
+    <w:multiLevelType w:val="multilevel"/>
+    <w:tmpl w:val="76229C04"/>
+    <w:lvl w:ilvl="0">
+      <w:start w:val="1"/>
+      <w:numFmt w:val="bullet"/>
+      <w:lvlText w:val=""/>
+      <w:lvlJc w:val="left"/>
+      <w:pPr>
+        <w:tabs>
+          <w:tab w:val="num" w:pos="720"/>
+        </w:tabs>
+        <w:ind w:left="720" w:hanging="360"/>
+      </w:pPr>
+      <w:rPr>
+        <w:rFonts w:ascii="Symbol" w:hAnsi="Symbol" w:hint="default"/>
+        <w:sz w:val="20"/>
+      </w:rPr>
+    </w:lvl>
+    <w:lvl w:ilvl="1" w:tentative="1">
+      <w:start w:val="1"/>
+      <w:numFmt w:val="bullet"/>
+      <w:lvlText w:val="o"/>
+      <w:lvlJc w:val="left"/>
+      <w:pPr>
+        <w:tabs>
+          <w:tab w:val="num" w:pos="1440"/>
+        </w:tabs>
+        <w:ind w:left="1440" w:hanging="360"/>
+      </w:pPr>
+      <w:rPr>
+        <w:rFonts w:ascii="Courier New" w:hAnsi="Courier New" w:hint="default"/>
+        <w:sz w:val="20"/>
+      </w:rPr>
+    </w:lvl>
+    <w:lvl w:ilvl="2" w:tentative="1">
+      <w:start w:val="1"/>
+      <w:numFmt w:val="bullet"/>
+      <w:lvlText w:val=""/>
+      <w:lvlJc w:val="left"/>
+      <w:pPr>
+        <w:tabs>
+          <w:tab w:val="num" w:pos="2160"/>
+        </w:tabs>
+        <w:ind w:left="2160" w:hanging="360"/>
+      </w:pPr>
+      <w:rPr>
+        <w:rFonts w:ascii="Wingdings" w:hAnsi="Wingdings" w:hint="default"/>
+        <w:sz w:val="20"/>
+      </w:rPr>
+    </w:lvl>
+    <w:lvl w:ilvl="3" w:tentative="1">
+      <w:start w:val="1"/>
+      <w:numFmt w:val="bullet"/>
+      <w:lvlText w:val=""/>
+      <w:lvlJc w:val="left"/>
+      <w:pPr>
+        <w:tabs>
+          <w:tab w:val="num" w:pos="2880"/>
+        </w:tabs>
+        <w:ind w:left="2880" w:hanging="360"/>
+      </w:pPr>
+      <w:rPr>
+        <w:rFonts w:ascii="Wingdings" w:hAnsi="Wingdings" w:hint="default"/>
+        <w:sz w:val="20"/>
+      </w:rPr>
+    </w:lvl>
+    <w:lvl w:ilvl="4" w:tentative="1">
+      <w:start w:val="1"/>
+      <w:numFmt w:val="bullet"/>
+      <w:lvlText w:val=""/>
+      <w:lvlJc w:val="left"/>
+      <w:pPr>
+        <w:tabs>
+          <w:tab w:val="num" w:pos="3600"/>
+        </w:tabs>
+        <w:ind w:left="3600" w:hanging="360"/>
+      </w:pPr>
+      <w:rPr>
+        <w:rFonts w:ascii="Wingdings" w:hAnsi="Wingdings" w:hint="default"/>
+        <w:sz w:val="20"/>
+      </w:rPr>
+    </w:lvl>
+    <w:lvl w:ilvl="5" w:tentative="1">
+      <w:start w:val="1"/>
+      <w:numFmt w:val="bullet"/>
+      <w:lvlText w:val=""/>
+      <w:lvlJc w:val="left"/>
+      <w:pPr>
+        <w:tabs>
+          <w:tab w:val="num" w:pos="4320"/>
+        </w:tabs>
+        <w:ind w:left="4320" w:hanging="360"/>
+      </w:pPr>
+      <w:rPr>
+        <w:rFonts w:ascii="Wingdings" w:hAnsi="Wingdings" w:hint="default"/>
+        <w:sz w:val="20"/>
+      </w:rPr>
+    </w:lvl>
+    <w:lvl w:ilvl="6" w:tentative="1">
+      <w:start w:val="1"/>
+      <w:numFmt w:val="bullet"/>
+      <w:lvlText w:val=""/>
+      <w:lvlJc w:val="left"/>
+      <w:pPr>
+        <w:tabs>
+          <w:tab w:val="num" w:pos="5040"/>
+        </w:tabs>
+        <w:ind w:left="5040" w:hanging="360"/>
+      </w:pPr>
+      <w:rPr>
+        <w:rFonts w:ascii="Wingdings" w:hAnsi="Wingdings" w:hint="default"/>
+        <w:sz w:val="20"/>
+      </w:rPr>
+    </w:lvl>
+    <w:lvl w:ilvl="7" w:tentative="1">
+      <w:start w:val="1"/>
+      <w:numFmt w:val="bullet"/>
+      <w:lvlText w:val=""/>
+      <w:lvlJc w:val="left"/>
+      <w:pPr>
+        <w:tabs>
+          <w:tab w:val="num" w:pos="5760"/>
+        </w:tabs>
+        <w:ind w:left="5760" w:hanging="360"/>
+      </w:pPr>
+      <w:rPr>
+        <w:rFonts w:ascii="Wingdings" w:hAnsi="Wingdings" w:hint="default"/>
+        <w:sz w:val="20"/>
+      </w:rPr>
+    </w:lvl>
+    <w:lvl w:ilvl="8" w:tentative="1">
+      <w:start w:val="1"/>
+      <w:numFmt w:val="bullet"/>
+      <w:lvlText w:val=""/>
+      <w:lvlJc w:val="left"/>
+      <w:pPr>
+        <w:tabs>
+          <w:tab w:val="num" w:pos="6480"/>
+        </w:tabs>
+        <w:ind w:left="6480" w:hanging="360"/>
+      </w:pPr>
+      <w:rPr>
+        <w:rFonts w:ascii="Wingdings" w:hAnsi="Wingdings" w:hint="default"/>
+        <w:sz w:val="20"/>
+      </w:rPr>
+    </w:lvl>
+  </w:abstractNum>
+  <w:abstractNum w:abstractNumId="17" w15:restartNumberingAfterBreak="0">
     <w:nsid w:val="382A5D1D"/>
     <w:multiLevelType w:val="multilevel"/>
     <w:tmpl w:val="E9BEDADC"/>
@@ -6823,7 +8415,7 @@
       </w:rPr>
     </w:lvl>
   </w:abstractNum>
-  <w:abstractNum w:abstractNumId="16" w15:restartNumberingAfterBreak="0">
+  <w:abstractNum w:abstractNumId="18" w15:restartNumberingAfterBreak="0">
     <w:nsid w:val="382E7FDD"/>
     <w:multiLevelType w:val="multilevel"/>
     <w:tmpl w:val="10665E3A"/>
@@ -6972,7 +8564,7 @@
       </w:rPr>
     </w:lvl>
   </w:abstractNum>
-  <w:abstractNum w:abstractNumId="17" w15:restartNumberingAfterBreak="0">
+  <w:abstractNum w:abstractNumId="19" w15:restartNumberingAfterBreak="0">
     <w:nsid w:val="3DB466B9"/>
     <w:multiLevelType w:val="multilevel"/>
     <w:tmpl w:val="1CF40A22"/>
@@ -7121,7 +8713,7 @@
       </w:rPr>
     </w:lvl>
   </w:abstractNum>
-  <w:abstractNum w:abstractNumId="18" w15:restartNumberingAfterBreak="0">
+  <w:abstractNum w:abstractNumId="20" w15:restartNumberingAfterBreak="0">
     <w:nsid w:val="42707319"/>
     <w:multiLevelType w:val="multilevel"/>
     <w:tmpl w:val="C30C2DBA"/>
@@ -7270,7 +8862,7 @@
       </w:rPr>
     </w:lvl>
   </w:abstractNum>
-  <w:abstractNum w:abstractNumId="19" w15:restartNumberingAfterBreak="0">
+  <w:abstractNum w:abstractNumId="21" w15:restartNumberingAfterBreak="0">
     <w:nsid w:val="427306F7"/>
     <w:multiLevelType w:val="multilevel"/>
     <w:tmpl w:val="E8408A3C"/>
@@ -7419,7 +9011,7 @@
       </w:rPr>
     </w:lvl>
   </w:abstractNum>
-  <w:abstractNum w:abstractNumId="20" w15:restartNumberingAfterBreak="0">
+  <w:abstractNum w:abstractNumId="22" w15:restartNumberingAfterBreak="0">
     <w:nsid w:val="45231114"/>
     <w:multiLevelType w:val="multilevel"/>
     <w:tmpl w:val="E0FCABFA"/>
@@ -7568,7 +9160,7 @@
       </w:rPr>
     </w:lvl>
   </w:abstractNum>
-  <w:abstractNum w:abstractNumId="21" w15:restartNumberingAfterBreak="0">
+  <w:abstractNum w:abstractNumId="23" w15:restartNumberingAfterBreak="0">
     <w:nsid w:val="488C790F"/>
     <w:multiLevelType w:val="multilevel"/>
     <w:tmpl w:val="011E25EA"/>
@@ -7717,7 +9309,7 @@
       </w:rPr>
     </w:lvl>
   </w:abstractNum>
-  <w:abstractNum w:abstractNumId="22" w15:restartNumberingAfterBreak="0">
+  <w:abstractNum w:abstractNumId="24" w15:restartNumberingAfterBreak="0">
     <w:nsid w:val="5A8735ED"/>
     <w:multiLevelType w:val="multilevel"/>
     <w:tmpl w:val="F182A058"/>
@@ -7866,7 +9458,7 @@
       </w:rPr>
     </w:lvl>
   </w:abstractNum>
-  <w:abstractNum w:abstractNumId="23" w15:restartNumberingAfterBreak="0">
+  <w:abstractNum w:abstractNumId="25" w15:restartNumberingAfterBreak="0">
     <w:nsid w:val="5CA979F0"/>
     <w:multiLevelType w:val="multilevel"/>
     <w:tmpl w:val="68A04D6E"/>
@@ -8015,7 +9607,7 @@
       </w:rPr>
     </w:lvl>
   </w:abstractNum>
-  <w:abstractNum w:abstractNumId="24" w15:restartNumberingAfterBreak="0">
+  <w:abstractNum w:abstractNumId="26" w15:restartNumberingAfterBreak="0">
     <w:nsid w:val="611365D4"/>
     <w:multiLevelType w:val="multilevel"/>
     <w:tmpl w:val="7AA23C38"/>
@@ -8164,7 +9756,7 @@
       </w:rPr>
     </w:lvl>
   </w:abstractNum>
-  <w:abstractNum w:abstractNumId="25" w15:restartNumberingAfterBreak="0">
+  <w:abstractNum w:abstractNumId="27" w15:restartNumberingAfterBreak="0">
     <w:nsid w:val="64FE20C2"/>
     <w:multiLevelType w:val="multilevel"/>
     <w:tmpl w:val="E15ADD1A"/>
@@ -8313,7 +9905,7 @@
       </w:rPr>
     </w:lvl>
   </w:abstractNum>
-  <w:abstractNum w:abstractNumId="26" w15:restartNumberingAfterBreak="0">
+  <w:abstractNum w:abstractNumId="28" w15:restartNumberingAfterBreak="0">
     <w:nsid w:val="6D2C7FDC"/>
     <w:multiLevelType w:val="multilevel"/>
     <w:tmpl w:val="BB809A0C"/>
@@ -8462,7 +10054,7 @@
       </w:rPr>
     </w:lvl>
   </w:abstractNum>
-  <w:abstractNum w:abstractNumId="27" w15:restartNumberingAfterBreak="0">
+  <w:abstractNum w:abstractNumId="29" w15:restartNumberingAfterBreak="0">
     <w:nsid w:val="7C5522DB"/>
     <w:multiLevelType w:val="multilevel"/>
     <w:tmpl w:val="E8EA018E"/>
@@ -8611,7 +10203,7 @@
       </w:rPr>
     </w:lvl>
   </w:abstractNum>
-  <w:abstractNum w:abstractNumId="28" w15:restartNumberingAfterBreak="0">
+  <w:abstractNum w:abstractNumId="30" w15:restartNumberingAfterBreak="0">
     <w:nsid w:val="7F0F32C6"/>
     <w:multiLevelType w:val="multilevel"/>
     <w:tmpl w:val="085C2118"/>
@@ -8761,40 +10353,40 @@
     </w:lvl>
   </w:abstractNum>
   <w:num w:numId="1" w16cid:durableId="2002003958">
-    <w:abstractNumId w:val="22"/>
+    <w:abstractNumId w:val="24"/>
   </w:num>
   <w:num w:numId="2" w16cid:durableId="639923306">
-    <w:abstractNumId w:val="16"/>
+    <w:abstractNumId w:val="18"/>
   </w:num>
   <w:num w:numId="3" w16cid:durableId="371273694">
-    <w:abstractNumId w:val="13"/>
+    <w:abstractNumId w:val="14"/>
   </w:num>
   <w:num w:numId="4" w16cid:durableId="1545872702">
     <w:abstractNumId w:val="4"/>
   </w:num>
   <w:num w:numId="5" w16cid:durableId="238486708">
-    <w:abstractNumId w:val="28"/>
+    <w:abstractNumId w:val="30"/>
   </w:num>
   <w:num w:numId="6" w16cid:durableId="1527213921">
-    <w:abstractNumId w:val="8"/>
+    <w:abstractNumId w:val="9"/>
   </w:num>
   <w:num w:numId="7" w16cid:durableId="1343389359">
-    <w:abstractNumId w:val="9"/>
+    <w:abstractNumId w:val="10"/>
   </w:num>
   <w:num w:numId="8" w16cid:durableId="28921018">
-    <w:abstractNumId w:val="27"/>
+    <w:abstractNumId w:val="29"/>
   </w:num>
   <w:num w:numId="9" w16cid:durableId="1554274342">
-    <w:abstractNumId w:val="24"/>
+    <w:abstractNumId w:val="26"/>
   </w:num>
   <w:num w:numId="10" w16cid:durableId="235095700">
-    <w:abstractNumId w:val="20"/>
+    <w:abstractNumId w:val="22"/>
   </w:num>
   <w:num w:numId="11" w16cid:durableId="87897032">
-    <w:abstractNumId w:val="11"/>
+    <w:abstractNumId w:val="12"/>
   </w:num>
   <w:num w:numId="12" w16cid:durableId="1128354387">
-    <w:abstractNumId w:val="19"/>
+    <w:abstractNumId w:val="21"/>
   </w:num>
   <w:num w:numId="13" w16cid:durableId="2088646245">
     <w:abstractNumId w:val="2"/>
@@ -8806,46 +10398,52 @@
     <w:abstractNumId w:val="5"/>
   </w:num>
   <w:num w:numId="16" w16cid:durableId="1192495118">
-    <w:abstractNumId w:val="6"/>
+    <w:abstractNumId w:val="7"/>
   </w:num>
   <w:num w:numId="17" w16cid:durableId="155733822">
+    <w:abstractNumId w:val="19"/>
+  </w:num>
+  <w:num w:numId="18" w16cid:durableId="483014392">
+    <w:abstractNumId w:val="13"/>
+  </w:num>
+  <w:num w:numId="19" w16cid:durableId="1858809364">
+    <w:abstractNumId w:val="15"/>
+  </w:num>
+  <w:num w:numId="20" w16cid:durableId="1909344899">
     <w:abstractNumId w:val="17"/>
   </w:num>
-  <w:num w:numId="18" w16cid:durableId="483014392">
-    <w:abstractNumId w:val="12"/>
-  </w:num>
-  <w:num w:numId="19" w16cid:durableId="1858809364">
-    <w:abstractNumId w:val="14"/>
-  </w:num>
-  <w:num w:numId="20" w16cid:durableId="1909344899">
-    <w:abstractNumId w:val="15"/>
-  </w:num>
   <w:num w:numId="21" w16cid:durableId="18357922">
-    <w:abstractNumId w:val="7"/>
+    <w:abstractNumId w:val="8"/>
   </w:num>
   <w:num w:numId="22" w16cid:durableId="1662663482">
+    <w:abstractNumId w:val="27"/>
+  </w:num>
+  <w:num w:numId="23" w16cid:durableId="1796480336">
     <w:abstractNumId w:val="25"/>
   </w:num>
-  <w:num w:numId="23" w16cid:durableId="1796480336">
+  <w:num w:numId="24" w16cid:durableId="1795362512">
     <w:abstractNumId w:val="23"/>
   </w:num>
-  <w:num w:numId="24" w16cid:durableId="1795362512">
-    <w:abstractNumId w:val="21"/>
-  </w:num>
   <w:num w:numId="25" w16cid:durableId="687099638">
-    <w:abstractNumId w:val="26"/>
+    <w:abstractNumId w:val="28"/>
   </w:num>
   <w:num w:numId="26" w16cid:durableId="1881086971">
     <w:abstractNumId w:val="0"/>
   </w:num>
   <w:num w:numId="27" w16cid:durableId="913467543">
-    <w:abstractNumId w:val="10"/>
+    <w:abstractNumId w:val="11"/>
   </w:num>
   <w:num w:numId="28" w16cid:durableId="1353602738">
-    <w:abstractNumId w:val="18"/>
+    <w:abstractNumId w:val="20"/>
   </w:num>
   <w:num w:numId="29" w16cid:durableId="2055693299">
     <w:abstractNumId w:val="1"/>
+  </w:num>
+  <w:num w:numId="30" w16cid:durableId="1463385926">
+    <w:abstractNumId w:val="16"/>
+  </w:num>
+  <w:num w:numId="31" w16cid:durableId="432437980">
+    <w:abstractNumId w:val="6"/>
   </w:num>
 </w:numbering>
 </file>
@@ -9250,7 +10848,7 @@
   <w:style w:type="paragraph" w:default="1" w:styleId="Normal">
     <w:name w:val="Normal"/>
     <w:qFormat/>
-    <w:rsid w:val="00BC0A62"/>
+    <w:rsid w:val="00BA476C"/>
   </w:style>
   <w:style w:type="paragraph" w:styleId="Ttulo1">
     <w:name w:val="heading 1"/>

</xml_diff>